<commit_message>
feat: Enhance review management functionality with new API endpoints and unit tests
</commit_message>
<xml_diff>
--- a/docs/SRS Library Management.docx
+++ b/docs/SRS Library Management.docx
@@ -63,14 +63,6 @@
           <w:szCs w:val="30"/>
         </w:rPr>
         <w:br/>
-      </w:r>
-      <w:r>
-        <w:rPr>
-          <w:rFonts w:ascii="Google Sans" w:eastAsia="Google Sans" w:hAnsi="Google Sans" w:cs="Google Sans"/>
-          <w:color w:val="1B1C1D"/>
-          <w:sz w:val="30"/>
-          <w:szCs w:val="30"/>
-        </w:rPr>
         <w:t>Table of Contents</w:t>
       </w:r>
     </w:p>
@@ -1212,25 +1204,14 @@
         </w:pBdr>
         <w:spacing w:line="275" w:lineRule="auto"/>
       </w:pPr>
-      <w:proofErr w:type="gramStart"/>
-      <w:r>
-        <w:rPr>
-          <w:rFonts w:ascii="Google Sans Text" w:eastAsia="Google Sans Text" w:hAnsi="Google Sans Text" w:cs="Google Sans Text"/>
-          <w:color w:val="1B1C1D"/>
-          <w:sz w:val="24"/>
-          <w:szCs w:val="24"/>
-        </w:rPr>
-        <w:t>Tracking of</w:t>
-      </w:r>
-      <w:proofErr w:type="gramEnd"/>
-      <w:r>
-        <w:rPr>
-          <w:rFonts w:ascii="Google Sans Text" w:eastAsia="Google Sans Text" w:hAnsi="Google Sans Text" w:cs="Google Sans Text"/>
-          <w:color w:val="1B1C1D"/>
-          <w:sz w:val="24"/>
-          <w:szCs w:val="24"/>
-        </w:rPr>
-        <w:t xml:space="preserve"> book </w:t>
+      <w:r>
+        <w:rPr>
+          <w:rFonts w:ascii="Google Sans Text" w:eastAsia="Google Sans Text" w:hAnsi="Google Sans Text" w:cs="Google Sans Text"/>
+          <w:color w:val="1B1C1D"/>
+          <w:sz w:val="24"/>
+          <w:szCs w:val="24"/>
+        </w:rPr>
+        <w:t xml:space="preserve">Tracking of book </w:t>
       </w:r>
       <w:proofErr w:type="spellStart"/>
       <w:r>
@@ -1845,7 +1826,7 @@
           <w:sz w:val="24"/>
           <w:szCs w:val="24"/>
         </w:rPr>
-        <w:t>CRUD operations for Reviews.</w:t>
+        <w:t>CRUD operations for Reviews. (New Feature)</w:t>
       </w:r>
     </w:p>
     <w:p>
@@ -2513,27 +2494,7 @@
           <w:sz w:val="24"/>
           <w:szCs w:val="24"/>
         </w:rPr>
-        <w:t xml:space="preserve">User authentication </w:t>
-      </w:r>
-      <w:proofErr w:type="gramStart"/>
-      <w:r>
-        <w:rPr>
-          <w:rFonts w:ascii="Google Sans Text" w:eastAsia="Google Sans Text" w:hAnsi="Google Sans Text" w:cs="Google Sans Text"/>
-          <w:color w:val="1B1C1D"/>
-          <w:sz w:val="24"/>
-          <w:szCs w:val="24"/>
-        </w:rPr>
-        <w:t>shall</w:t>
-      </w:r>
-      <w:proofErr w:type="gramEnd"/>
-      <w:r>
-        <w:rPr>
-          <w:rFonts w:ascii="Google Sans Text" w:eastAsia="Google Sans Text" w:hAnsi="Google Sans Text" w:cs="Google Sans Text"/>
-          <w:color w:val="1B1C1D"/>
-          <w:sz w:val="24"/>
-          <w:szCs w:val="24"/>
-        </w:rPr>
-        <w:t xml:space="preserve"> use Passport.js with a local strategy (email and password).</w:t>
+        <w:t>User authentication shall use Passport.js with a local strategy (email and password).</w:t>
       </w:r>
     </w:p>
     <w:p>
@@ -2558,27 +2519,7 @@
           <w:sz w:val="24"/>
           <w:szCs w:val="24"/>
         </w:rPr>
-        <w:t xml:space="preserve">The system </w:t>
-      </w:r>
-      <w:proofErr w:type="gramStart"/>
-      <w:r>
-        <w:rPr>
-          <w:rFonts w:ascii="Google Sans Text" w:eastAsia="Google Sans Text" w:hAnsi="Google Sans Text" w:cs="Google Sans Text"/>
-          <w:color w:val="1B1C1D"/>
-          <w:sz w:val="24"/>
-          <w:szCs w:val="24"/>
-        </w:rPr>
-        <w:t>shall</w:t>
-      </w:r>
-      <w:proofErr w:type="gramEnd"/>
-      <w:r>
-        <w:rPr>
-          <w:rFonts w:ascii="Google Sans Text" w:eastAsia="Google Sans Text" w:hAnsi="Google Sans Text" w:cs="Google Sans Text"/>
-          <w:color w:val="1B1C1D"/>
-          <w:sz w:val="24"/>
-          <w:szCs w:val="24"/>
-        </w:rPr>
-        <w:t xml:space="preserve"> provide a RESTful API for communication between the client and server.</w:t>
+        <w:t>The system shall provide a RESTful API for communication between the client and server.</w:t>
       </w:r>
     </w:p>
     <w:p>
@@ -2884,47 +2825,7 @@
           <w:sz w:val="24"/>
           <w:szCs w:val="24"/>
         </w:rPr>
-        <w:t xml:space="preserve"> The system </w:t>
-      </w:r>
-      <w:proofErr w:type="gramStart"/>
-      <w:r>
-        <w:rPr>
-          <w:rFonts w:ascii="Google Sans Text" w:eastAsia="Google Sans Text" w:hAnsi="Google Sans Text" w:cs="Google Sans Text"/>
-          <w:color w:val="1B1C1D"/>
-          <w:sz w:val="24"/>
-          <w:szCs w:val="24"/>
-        </w:rPr>
-        <w:t>shall</w:t>
-      </w:r>
-      <w:proofErr w:type="gramEnd"/>
-      <w:r>
-        <w:rPr>
-          <w:rFonts w:ascii="Google Sans Text" w:eastAsia="Google Sans Text" w:hAnsi="Google Sans Text" w:cs="Google Sans Text"/>
-          <w:color w:val="1B1C1D"/>
-          <w:sz w:val="24"/>
-          <w:szCs w:val="24"/>
-        </w:rPr>
-        <w:t xml:space="preserve"> validate the input data. The password shall be hashed and salted before storing. A new user record </w:t>
-      </w:r>
-      <w:proofErr w:type="gramStart"/>
-      <w:r>
-        <w:rPr>
-          <w:rFonts w:ascii="Google Sans Text" w:eastAsia="Google Sans Text" w:hAnsi="Google Sans Text" w:cs="Google Sans Text"/>
-          <w:color w:val="1B1C1D"/>
-          <w:sz w:val="24"/>
-          <w:szCs w:val="24"/>
-        </w:rPr>
-        <w:t>shall</w:t>
-      </w:r>
-      <w:proofErr w:type="gramEnd"/>
-      <w:r>
-        <w:rPr>
-          <w:rFonts w:ascii="Google Sans Text" w:eastAsia="Google Sans Text" w:hAnsi="Google Sans Text" w:cs="Google Sans Text"/>
-          <w:color w:val="1B1C1D"/>
-          <w:sz w:val="24"/>
-          <w:szCs w:val="24"/>
-        </w:rPr>
-        <w:t xml:space="preserve"> be created in the database.</w:t>
+        <w:t xml:space="preserve"> The system shall validate the input data. The password shall be hashed and salted before storing. A new user record shall be created in the database.</w:t>
       </w:r>
     </w:p>
     <w:p>
@@ -3084,7 +2985,6 @@
         </w:pBdr>
         <w:spacing w:line="275" w:lineRule="auto"/>
       </w:pPr>
-      <w:proofErr w:type="gramStart"/>
       <w:r>
         <w:rPr>
           <w:rFonts w:ascii="Google Sans Text" w:eastAsia="Google Sans Text" w:hAnsi="Google Sans Text" w:cs="Google Sans Text"/>
@@ -3093,18 +2993,7 @@
           <w:sz w:val="24"/>
           <w:szCs w:val="24"/>
         </w:rPr>
-        <w:t>Inputs</w:t>
-      </w:r>
-      <w:proofErr w:type="gramEnd"/>
-      <w:r>
-        <w:rPr>
-          <w:rFonts w:ascii="Google Sans Text" w:eastAsia="Google Sans Text" w:hAnsi="Google Sans Text" w:cs="Google Sans Text"/>
-          <w:b/>
-          <w:color w:val="1B1C1D"/>
-          <w:sz w:val="24"/>
-          <w:szCs w:val="24"/>
-        </w:rPr>
-        <w:t>:</w:t>
+        <w:t>Inputs:</w:t>
       </w:r>
       <w:r>
         <w:rPr>
@@ -3786,25 +3675,14 @@
         </w:pBdr>
         <w:spacing w:line="275" w:lineRule="auto"/>
       </w:pPr>
-      <w:proofErr w:type="gramStart"/>
-      <w:r>
-        <w:rPr>
-          <w:rFonts w:ascii="Google Sans Text" w:eastAsia="Google Sans Text" w:hAnsi="Google Sans Text" w:cs="Google Sans Text"/>
-          <w:color w:val="1B1C1D"/>
-          <w:sz w:val="24"/>
-          <w:szCs w:val="24"/>
-        </w:rPr>
-        <w:t>Shall</w:t>
-      </w:r>
-      <w:proofErr w:type="gramEnd"/>
-      <w:r>
-        <w:rPr>
-          <w:rFonts w:ascii="Google Sans Text" w:eastAsia="Google Sans Text" w:hAnsi="Google Sans Text" w:cs="Google Sans Text"/>
-          <w:color w:val="1B1C1D"/>
-          <w:sz w:val="24"/>
-          <w:szCs w:val="24"/>
-        </w:rPr>
-        <w:t xml:space="preserve"> be able to view a list of all books. (API: GET /</w:t>
+      <w:r>
+        <w:rPr>
+          <w:rFonts w:ascii="Google Sans Text" w:eastAsia="Google Sans Text" w:hAnsi="Google Sans Text" w:cs="Google Sans Text"/>
+          <w:color w:val="1B1C1D"/>
+          <w:sz w:val="24"/>
+          <w:szCs w:val="24"/>
+        </w:rPr>
+        <w:t>Shall be able to view a list of all books. (API: GET /</w:t>
       </w:r>
       <w:proofErr w:type="spellStart"/>
       <w:r>
@@ -3862,25 +3740,14 @@
         </w:pBdr>
         <w:spacing w:line="275" w:lineRule="auto"/>
       </w:pPr>
-      <w:proofErr w:type="gramStart"/>
-      <w:r>
-        <w:rPr>
-          <w:rFonts w:ascii="Google Sans Text" w:eastAsia="Google Sans Text" w:hAnsi="Google Sans Text" w:cs="Google Sans Text"/>
-          <w:color w:val="1B1C1D"/>
-          <w:sz w:val="24"/>
-          <w:szCs w:val="24"/>
-        </w:rPr>
-        <w:t>Shall</w:t>
-      </w:r>
-      <w:proofErr w:type="gramEnd"/>
-      <w:r>
-        <w:rPr>
-          <w:rFonts w:ascii="Google Sans Text" w:eastAsia="Google Sans Text" w:hAnsi="Google Sans Text" w:cs="Google Sans Text"/>
-          <w:color w:val="1B1C1D"/>
-          <w:sz w:val="24"/>
-          <w:szCs w:val="24"/>
-        </w:rPr>
-        <w:t xml:space="preserve"> be able to view details of a specific book. (API: GET /</w:t>
+      <w:r>
+        <w:rPr>
+          <w:rFonts w:ascii="Google Sans Text" w:eastAsia="Google Sans Text" w:hAnsi="Google Sans Text" w:cs="Google Sans Text"/>
+          <w:color w:val="1B1C1D"/>
+          <w:sz w:val="24"/>
+          <w:szCs w:val="24"/>
+        </w:rPr>
+        <w:t>Shall be able to view details of a specific book. (API: GET /</w:t>
       </w:r>
       <w:proofErr w:type="spellStart"/>
       <w:r>
@@ -3938,25 +3805,14 @@
         </w:pBdr>
         <w:spacing w:line="275" w:lineRule="auto"/>
       </w:pPr>
-      <w:proofErr w:type="gramStart"/>
-      <w:r>
-        <w:rPr>
-          <w:rFonts w:ascii="Google Sans Text" w:eastAsia="Google Sans Text" w:hAnsi="Google Sans Text" w:cs="Google Sans Text"/>
-          <w:color w:val="1B1C1D"/>
-          <w:sz w:val="24"/>
-          <w:szCs w:val="24"/>
-        </w:rPr>
-        <w:t>Shall</w:t>
-      </w:r>
-      <w:proofErr w:type="gramEnd"/>
-      <w:r>
-        <w:rPr>
-          <w:rFonts w:ascii="Google Sans Text" w:eastAsia="Google Sans Text" w:hAnsi="Google Sans Text" w:cs="Google Sans Text"/>
-          <w:color w:val="1B1C1D"/>
-          <w:sz w:val="24"/>
-          <w:szCs w:val="24"/>
-        </w:rPr>
-        <w:t xml:space="preserve"> be able to update existing book details. (API: PUT /</w:t>
+      <w:r>
+        <w:rPr>
+          <w:rFonts w:ascii="Google Sans Text" w:eastAsia="Google Sans Text" w:hAnsi="Google Sans Text" w:cs="Google Sans Text"/>
+          <w:color w:val="1B1C1D"/>
+          <w:sz w:val="24"/>
+          <w:szCs w:val="24"/>
+        </w:rPr>
+        <w:t>Shall be able to update existing book details. (API: PUT /</w:t>
       </w:r>
       <w:proofErr w:type="spellStart"/>
       <w:r>
@@ -3994,25 +3850,14 @@
         </w:pBdr>
         <w:spacing w:line="275" w:lineRule="auto"/>
       </w:pPr>
-      <w:proofErr w:type="gramStart"/>
-      <w:r>
-        <w:rPr>
-          <w:rFonts w:ascii="Google Sans Text" w:eastAsia="Google Sans Text" w:hAnsi="Google Sans Text" w:cs="Google Sans Text"/>
-          <w:color w:val="1B1C1D"/>
-          <w:sz w:val="24"/>
-          <w:szCs w:val="24"/>
-        </w:rPr>
-        <w:t>Shall</w:t>
-      </w:r>
-      <w:proofErr w:type="gramEnd"/>
-      <w:r>
-        <w:rPr>
-          <w:rFonts w:ascii="Google Sans Text" w:eastAsia="Google Sans Text" w:hAnsi="Google Sans Text" w:cs="Google Sans Text"/>
-          <w:color w:val="1B1C1D"/>
-          <w:sz w:val="24"/>
-          <w:szCs w:val="24"/>
-        </w:rPr>
-        <w:t xml:space="preserve"> be able to delete books. (API: DELETE /</w:t>
+      <w:r>
+        <w:rPr>
+          <w:rFonts w:ascii="Google Sans Text" w:eastAsia="Google Sans Text" w:hAnsi="Google Sans Text" w:cs="Google Sans Text"/>
+          <w:color w:val="1B1C1D"/>
+          <w:sz w:val="24"/>
+          <w:szCs w:val="24"/>
+        </w:rPr>
+        <w:t>Shall be able to delete books. (API: DELETE /</w:t>
       </w:r>
       <w:proofErr w:type="spellStart"/>
       <w:r>
@@ -4096,25 +3941,14 @@
         </w:pBdr>
         <w:spacing w:line="275" w:lineRule="auto"/>
       </w:pPr>
-      <w:proofErr w:type="gramStart"/>
-      <w:r>
-        <w:rPr>
-          <w:rFonts w:ascii="Google Sans Text" w:eastAsia="Google Sans Text" w:hAnsi="Google Sans Text" w:cs="Google Sans Text"/>
-          <w:color w:val="1B1C1D"/>
-          <w:sz w:val="24"/>
-          <w:szCs w:val="24"/>
-        </w:rPr>
-        <w:t>Shall</w:t>
-      </w:r>
-      <w:proofErr w:type="gramEnd"/>
-      <w:r>
-        <w:rPr>
-          <w:rFonts w:ascii="Google Sans Text" w:eastAsia="Google Sans Text" w:hAnsi="Google Sans Text" w:cs="Google Sans Text"/>
-          <w:color w:val="1B1C1D"/>
-          <w:sz w:val="24"/>
-          <w:szCs w:val="24"/>
-        </w:rPr>
-        <w:t xml:space="preserve"> be able to view a list of all books.</w:t>
+      <w:r>
+        <w:rPr>
+          <w:rFonts w:ascii="Google Sans Text" w:eastAsia="Google Sans Text" w:hAnsi="Google Sans Text" w:cs="Google Sans Text"/>
+          <w:color w:val="1B1C1D"/>
+          <w:sz w:val="24"/>
+          <w:szCs w:val="24"/>
+        </w:rPr>
+        <w:t>Shall be able to view a list of all books.</w:t>
       </w:r>
     </w:p>
     <w:p>
@@ -4132,25 +3966,14 @@
         </w:pBdr>
         <w:spacing w:line="275" w:lineRule="auto"/>
       </w:pPr>
-      <w:proofErr w:type="gramStart"/>
-      <w:r>
-        <w:rPr>
-          <w:rFonts w:ascii="Google Sans Text" w:eastAsia="Google Sans Text" w:hAnsi="Google Sans Text" w:cs="Google Sans Text"/>
-          <w:color w:val="1B1C1D"/>
-          <w:sz w:val="24"/>
-          <w:szCs w:val="24"/>
-        </w:rPr>
-        <w:t>Shall</w:t>
-      </w:r>
-      <w:proofErr w:type="gramEnd"/>
-      <w:r>
-        <w:rPr>
-          <w:rFonts w:ascii="Google Sans Text" w:eastAsia="Google Sans Text" w:hAnsi="Google Sans Text" w:cs="Google Sans Text"/>
-          <w:color w:val="1B1C1D"/>
-          <w:sz w:val="24"/>
-          <w:szCs w:val="24"/>
-        </w:rPr>
-        <w:t xml:space="preserve"> be able to view details of a specific book.</w:t>
+      <w:r>
+        <w:rPr>
+          <w:rFonts w:ascii="Google Sans Text" w:eastAsia="Google Sans Text" w:hAnsi="Google Sans Text" w:cs="Google Sans Text"/>
+          <w:color w:val="1B1C1D"/>
+          <w:sz w:val="24"/>
+          <w:szCs w:val="24"/>
+        </w:rPr>
+        <w:t>Shall be able to view details of a specific book.</w:t>
       </w:r>
     </w:p>
     <w:p>
@@ -4241,27 +4064,7 @@
           <w:sz w:val="24"/>
           <w:szCs w:val="24"/>
         </w:rPr>
-        <w:t xml:space="preserve"> The </w:t>
-      </w:r>
-      <w:proofErr w:type="gramStart"/>
-      <w:r>
-        <w:rPr>
-          <w:rFonts w:ascii="Google Sans Text" w:eastAsia="Google Sans Text" w:hAnsi="Google Sans Text" w:cs="Google Sans Text"/>
-          <w:color w:val="1B1C1D"/>
-          <w:sz w:val="24"/>
-          <w:szCs w:val="24"/>
-        </w:rPr>
-        <w:t>system shall</w:t>
-      </w:r>
-      <w:proofErr w:type="gramEnd"/>
-      <w:r>
-        <w:rPr>
-          <w:rFonts w:ascii="Google Sans Text" w:eastAsia="Google Sans Text" w:hAnsi="Google Sans Text" w:cs="Google Sans Text"/>
-          <w:color w:val="1B1C1D"/>
-          <w:sz w:val="24"/>
-          <w:szCs w:val="24"/>
-        </w:rPr>
-        <w:t xml:space="preserve"> allow management of author records.</w:t>
+        <w:t xml:space="preserve"> The system shall allow management of author records.</w:t>
       </w:r>
     </w:p>
     <w:p>
@@ -4340,25 +4143,14 @@
         </w:pBdr>
         <w:spacing w:line="275" w:lineRule="auto"/>
       </w:pPr>
-      <w:proofErr w:type="gramStart"/>
-      <w:r>
-        <w:rPr>
-          <w:rFonts w:ascii="Google Sans Text" w:eastAsia="Google Sans Text" w:hAnsi="Google Sans Text" w:cs="Google Sans Text"/>
-          <w:color w:val="1B1C1D"/>
-          <w:sz w:val="24"/>
-          <w:szCs w:val="24"/>
-        </w:rPr>
-        <w:t>Shall</w:t>
-      </w:r>
-      <w:proofErr w:type="gramEnd"/>
-      <w:r>
-        <w:rPr>
-          <w:rFonts w:ascii="Google Sans Text" w:eastAsia="Google Sans Text" w:hAnsi="Google Sans Text" w:cs="Google Sans Text"/>
-          <w:color w:val="1B1C1D"/>
-          <w:sz w:val="24"/>
-          <w:szCs w:val="24"/>
-        </w:rPr>
-        <w:t xml:space="preserve"> be able to add new authors. (API: POST /</w:t>
+      <w:r>
+        <w:rPr>
+          <w:rFonts w:ascii="Google Sans Text" w:eastAsia="Google Sans Text" w:hAnsi="Google Sans Text" w:cs="Google Sans Text"/>
+          <w:color w:val="1B1C1D"/>
+          <w:sz w:val="24"/>
+          <w:szCs w:val="24"/>
+        </w:rPr>
+        <w:t>Shall be able to add new authors. (API: POST /</w:t>
       </w:r>
       <w:proofErr w:type="spellStart"/>
       <w:r>
@@ -4396,25 +4188,14 @@
         </w:pBdr>
         <w:spacing w:line="275" w:lineRule="auto"/>
       </w:pPr>
-      <w:proofErr w:type="gramStart"/>
-      <w:r>
-        <w:rPr>
-          <w:rFonts w:ascii="Google Sans Text" w:eastAsia="Google Sans Text" w:hAnsi="Google Sans Text" w:cs="Google Sans Text"/>
-          <w:color w:val="1B1C1D"/>
-          <w:sz w:val="24"/>
-          <w:szCs w:val="24"/>
-        </w:rPr>
-        <w:t>Shall</w:t>
-      </w:r>
-      <w:proofErr w:type="gramEnd"/>
-      <w:r>
-        <w:rPr>
-          <w:rFonts w:ascii="Google Sans Text" w:eastAsia="Google Sans Text" w:hAnsi="Google Sans Text" w:cs="Google Sans Text"/>
-          <w:color w:val="1B1C1D"/>
-          <w:sz w:val="24"/>
-          <w:szCs w:val="24"/>
-        </w:rPr>
-        <w:t xml:space="preserve"> be able to view a list of all authors. (API: GET /</w:t>
+      <w:r>
+        <w:rPr>
+          <w:rFonts w:ascii="Google Sans Text" w:eastAsia="Google Sans Text" w:hAnsi="Google Sans Text" w:cs="Google Sans Text"/>
+          <w:color w:val="1B1C1D"/>
+          <w:sz w:val="24"/>
+          <w:szCs w:val="24"/>
+        </w:rPr>
+        <w:t>Shall be able to view a list of all authors. (API: GET /</w:t>
       </w:r>
       <w:proofErr w:type="spellStart"/>
       <w:r>
@@ -4472,25 +4253,14 @@
         </w:pBdr>
         <w:spacing w:line="275" w:lineRule="auto"/>
       </w:pPr>
-      <w:proofErr w:type="gramStart"/>
-      <w:r>
-        <w:rPr>
-          <w:rFonts w:ascii="Google Sans Text" w:eastAsia="Google Sans Text" w:hAnsi="Google Sans Text" w:cs="Google Sans Text"/>
-          <w:color w:val="1B1C1D"/>
-          <w:sz w:val="24"/>
-          <w:szCs w:val="24"/>
-        </w:rPr>
-        <w:t>Shall</w:t>
-      </w:r>
-      <w:proofErr w:type="gramEnd"/>
-      <w:r>
-        <w:rPr>
-          <w:rFonts w:ascii="Google Sans Text" w:eastAsia="Google Sans Text" w:hAnsi="Google Sans Text" w:cs="Google Sans Text"/>
-          <w:color w:val="1B1C1D"/>
-          <w:sz w:val="24"/>
-          <w:szCs w:val="24"/>
-        </w:rPr>
-        <w:t xml:space="preserve"> be able to view details of a specific author. (API: GET /</w:t>
+      <w:r>
+        <w:rPr>
+          <w:rFonts w:ascii="Google Sans Text" w:eastAsia="Google Sans Text" w:hAnsi="Google Sans Text" w:cs="Google Sans Text"/>
+          <w:color w:val="1B1C1D"/>
+          <w:sz w:val="24"/>
+          <w:szCs w:val="24"/>
+        </w:rPr>
+        <w:t>Shall be able to view details of a specific author. (API: GET /</w:t>
       </w:r>
       <w:proofErr w:type="spellStart"/>
       <w:r>
@@ -4548,25 +4318,14 @@
         </w:pBdr>
         <w:spacing w:line="275" w:lineRule="auto"/>
       </w:pPr>
-      <w:proofErr w:type="gramStart"/>
-      <w:r>
-        <w:rPr>
-          <w:rFonts w:ascii="Google Sans Text" w:eastAsia="Google Sans Text" w:hAnsi="Google Sans Text" w:cs="Google Sans Text"/>
-          <w:color w:val="1B1C1D"/>
-          <w:sz w:val="24"/>
-          <w:szCs w:val="24"/>
-        </w:rPr>
-        <w:t>Shall</w:t>
-      </w:r>
-      <w:proofErr w:type="gramEnd"/>
-      <w:r>
-        <w:rPr>
-          <w:rFonts w:ascii="Google Sans Text" w:eastAsia="Google Sans Text" w:hAnsi="Google Sans Text" w:cs="Google Sans Text"/>
-          <w:color w:val="1B1C1D"/>
-          <w:sz w:val="24"/>
-          <w:szCs w:val="24"/>
-        </w:rPr>
-        <w:t xml:space="preserve"> be able to update existing author details. (API: PUT /</w:t>
+      <w:r>
+        <w:rPr>
+          <w:rFonts w:ascii="Google Sans Text" w:eastAsia="Google Sans Text" w:hAnsi="Google Sans Text" w:cs="Google Sans Text"/>
+          <w:color w:val="1B1C1D"/>
+          <w:sz w:val="24"/>
+          <w:szCs w:val="24"/>
+        </w:rPr>
+        <w:t>Shall be able to update existing author details. (API: PUT /</w:t>
       </w:r>
       <w:proofErr w:type="spellStart"/>
       <w:r>
@@ -4586,27 +4345,7 @@
           <w:sz w:val="24"/>
           <w:szCs w:val="24"/>
         </w:rPr>
-        <w:t>/author/</w:t>
-      </w:r>
-      <w:proofErr w:type="gramStart"/>
-      <w:r>
-        <w:rPr>
-          <w:rFonts w:ascii="Google Sans Text" w:eastAsia="Google Sans Text" w:hAnsi="Google Sans Text" w:cs="Google Sans Text"/>
-          <w:color w:val="1B1C1D"/>
-          <w:sz w:val="24"/>
-          <w:szCs w:val="24"/>
-        </w:rPr>
-        <w:t>update/:</w:t>
-      </w:r>
-      <w:proofErr w:type="gramEnd"/>
-      <w:r>
-        <w:rPr>
-          <w:rFonts w:ascii="Google Sans Text" w:eastAsia="Google Sans Text" w:hAnsi="Google Sans Text" w:cs="Google Sans Text"/>
-          <w:color w:val="1B1C1D"/>
-          <w:sz w:val="24"/>
-          <w:szCs w:val="24"/>
-        </w:rPr>
-        <w:t>id)</w:t>
+        <w:t>/author/update/:id)</w:t>
       </w:r>
     </w:p>
     <w:p>
@@ -4715,25 +4454,14 @@
         </w:pBdr>
         <w:spacing w:line="275" w:lineRule="auto"/>
       </w:pPr>
-      <w:proofErr w:type="gramStart"/>
-      <w:r>
-        <w:rPr>
-          <w:rFonts w:ascii="Google Sans Text" w:eastAsia="Google Sans Text" w:hAnsi="Google Sans Text" w:cs="Google Sans Text"/>
-          <w:color w:val="1B1C1D"/>
-          <w:sz w:val="24"/>
-          <w:szCs w:val="24"/>
-        </w:rPr>
-        <w:t>Shall</w:t>
-      </w:r>
-      <w:proofErr w:type="gramEnd"/>
-      <w:r>
-        <w:rPr>
-          <w:rFonts w:ascii="Google Sans Text" w:eastAsia="Google Sans Text" w:hAnsi="Google Sans Text" w:cs="Google Sans Text"/>
-          <w:color w:val="1B1C1D"/>
-          <w:sz w:val="24"/>
-          <w:szCs w:val="24"/>
-        </w:rPr>
-        <w:t xml:space="preserve"> be able to view a list of all authors.</w:t>
+      <w:r>
+        <w:rPr>
+          <w:rFonts w:ascii="Google Sans Text" w:eastAsia="Google Sans Text" w:hAnsi="Google Sans Text" w:cs="Google Sans Text"/>
+          <w:color w:val="1B1C1D"/>
+          <w:sz w:val="24"/>
+          <w:szCs w:val="24"/>
+        </w:rPr>
+        <w:t>Shall be able to view a list of all authors.</w:t>
       </w:r>
     </w:p>
     <w:p>
@@ -4751,25 +4479,14 @@
         </w:pBdr>
         <w:spacing w:line="275" w:lineRule="auto"/>
       </w:pPr>
-      <w:proofErr w:type="gramStart"/>
-      <w:r>
-        <w:rPr>
-          <w:rFonts w:ascii="Google Sans Text" w:eastAsia="Google Sans Text" w:hAnsi="Google Sans Text" w:cs="Google Sans Text"/>
-          <w:color w:val="1B1C1D"/>
-          <w:sz w:val="24"/>
-          <w:szCs w:val="24"/>
-        </w:rPr>
-        <w:t>Shall</w:t>
-      </w:r>
-      <w:proofErr w:type="gramEnd"/>
-      <w:r>
-        <w:rPr>
-          <w:rFonts w:ascii="Google Sans Text" w:eastAsia="Google Sans Text" w:hAnsi="Google Sans Text" w:cs="Google Sans Text"/>
-          <w:color w:val="1B1C1D"/>
-          <w:sz w:val="24"/>
-          <w:szCs w:val="24"/>
-        </w:rPr>
-        <w:t xml:space="preserve"> be able to view details of a specific author.</w:t>
+      <w:r>
+        <w:rPr>
+          <w:rFonts w:ascii="Google Sans Text" w:eastAsia="Google Sans Text" w:hAnsi="Google Sans Text" w:cs="Google Sans Text"/>
+          <w:color w:val="1B1C1D"/>
+          <w:sz w:val="24"/>
+          <w:szCs w:val="24"/>
+        </w:rPr>
+        <w:t>Shall be able to view details of a specific author.</w:t>
       </w:r>
     </w:p>
     <w:p>
@@ -4940,25 +4657,14 @@
         </w:pBdr>
         <w:spacing w:line="275" w:lineRule="auto"/>
       </w:pPr>
-      <w:proofErr w:type="gramStart"/>
-      <w:r>
-        <w:rPr>
-          <w:rFonts w:ascii="Google Sans Text" w:eastAsia="Google Sans Text" w:hAnsi="Google Sans Text" w:cs="Google Sans Text"/>
-          <w:color w:val="1B1C1D"/>
-          <w:sz w:val="24"/>
-          <w:szCs w:val="24"/>
-        </w:rPr>
-        <w:t>Shall</w:t>
-      </w:r>
-      <w:proofErr w:type="gramEnd"/>
-      <w:r>
-        <w:rPr>
-          <w:rFonts w:ascii="Google Sans Text" w:eastAsia="Google Sans Text" w:hAnsi="Google Sans Text" w:cs="Google Sans Text"/>
-          <w:color w:val="1B1C1D"/>
-          <w:sz w:val="24"/>
-          <w:szCs w:val="24"/>
-        </w:rPr>
-        <w:t xml:space="preserve"> be able to add new genres. (API: POST /</w:t>
+      <w:r>
+        <w:rPr>
+          <w:rFonts w:ascii="Google Sans Text" w:eastAsia="Google Sans Text" w:hAnsi="Google Sans Text" w:cs="Google Sans Text"/>
+          <w:color w:val="1B1C1D"/>
+          <w:sz w:val="24"/>
+          <w:szCs w:val="24"/>
+        </w:rPr>
+        <w:t>Shall be able to add new genres. (API: POST /</w:t>
       </w:r>
       <w:proofErr w:type="spellStart"/>
       <w:r>
@@ -4996,25 +4702,14 @@
         </w:pBdr>
         <w:spacing w:line="275" w:lineRule="auto"/>
       </w:pPr>
-      <w:proofErr w:type="gramStart"/>
-      <w:r>
-        <w:rPr>
-          <w:rFonts w:ascii="Google Sans Text" w:eastAsia="Google Sans Text" w:hAnsi="Google Sans Text" w:cs="Google Sans Text"/>
-          <w:color w:val="1B1C1D"/>
-          <w:sz w:val="24"/>
-          <w:szCs w:val="24"/>
-        </w:rPr>
-        <w:t>Shall</w:t>
-      </w:r>
-      <w:proofErr w:type="gramEnd"/>
-      <w:r>
-        <w:rPr>
-          <w:rFonts w:ascii="Google Sans Text" w:eastAsia="Google Sans Text" w:hAnsi="Google Sans Text" w:cs="Google Sans Text"/>
-          <w:color w:val="1B1C1D"/>
-          <w:sz w:val="24"/>
-          <w:szCs w:val="24"/>
-        </w:rPr>
-        <w:t xml:space="preserve"> be able to view a list of all genres. (API: GET /</w:t>
+      <w:r>
+        <w:rPr>
+          <w:rFonts w:ascii="Google Sans Text" w:eastAsia="Google Sans Text" w:hAnsi="Google Sans Text" w:cs="Google Sans Text"/>
+          <w:color w:val="1B1C1D"/>
+          <w:sz w:val="24"/>
+          <w:szCs w:val="24"/>
+        </w:rPr>
+        <w:t>Shall be able to view a list of all genres. (API: GET /</w:t>
       </w:r>
       <w:proofErr w:type="spellStart"/>
       <w:r>
@@ -5072,25 +4767,14 @@
         </w:pBdr>
         <w:spacing w:line="275" w:lineRule="auto"/>
       </w:pPr>
-      <w:proofErr w:type="gramStart"/>
-      <w:r>
-        <w:rPr>
-          <w:rFonts w:ascii="Google Sans Text" w:eastAsia="Google Sans Text" w:hAnsi="Google Sans Text" w:cs="Google Sans Text"/>
-          <w:color w:val="1B1C1D"/>
-          <w:sz w:val="24"/>
-          <w:szCs w:val="24"/>
-        </w:rPr>
-        <w:t>Shall</w:t>
-      </w:r>
-      <w:proofErr w:type="gramEnd"/>
-      <w:r>
-        <w:rPr>
-          <w:rFonts w:ascii="Google Sans Text" w:eastAsia="Google Sans Text" w:hAnsi="Google Sans Text" w:cs="Google Sans Text"/>
-          <w:color w:val="1B1C1D"/>
-          <w:sz w:val="24"/>
-          <w:szCs w:val="24"/>
-        </w:rPr>
-        <w:t xml:space="preserve"> be able to view details of a specific genre. (API: GET /</w:t>
+      <w:r>
+        <w:rPr>
+          <w:rFonts w:ascii="Google Sans Text" w:eastAsia="Google Sans Text" w:hAnsi="Google Sans Text" w:cs="Google Sans Text"/>
+          <w:color w:val="1B1C1D"/>
+          <w:sz w:val="24"/>
+          <w:szCs w:val="24"/>
+        </w:rPr>
+        <w:t>Shall be able to view details of a specific genre. (API: GET /</w:t>
       </w:r>
       <w:proofErr w:type="spellStart"/>
       <w:r>
@@ -5148,25 +4832,14 @@
         </w:pBdr>
         <w:spacing w:line="275" w:lineRule="auto"/>
       </w:pPr>
-      <w:proofErr w:type="gramStart"/>
-      <w:r>
-        <w:rPr>
-          <w:rFonts w:ascii="Google Sans Text" w:eastAsia="Google Sans Text" w:hAnsi="Google Sans Text" w:cs="Google Sans Text"/>
-          <w:color w:val="1B1C1D"/>
-          <w:sz w:val="24"/>
-          <w:szCs w:val="24"/>
-        </w:rPr>
-        <w:t>Shall</w:t>
-      </w:r>
-      <w:proofErr w:type="gramEnd"/>
-      <w:r>
-        <w:rPr>
-          <w:rFonts w:ascii="Google Sans Text" w:eastAsia="Google Sans Text" w:hAnsi="Google Sans Text" w:cs="Google Sans Text"/>
-          <w:color w:val="1B1C1D"/>
-          <w:sz w:val="24"/>
-          <w:szCs w:val="24"/>
-        </w:rPr>
-        <w:t xml:space="preserve"> be able to update existing genre details. (API: PUT /</w:t>
+      <w:r>
+        <w:rPr>
+          <w:rFonts w:ascii="Google Sans Text" w:eastAsia="Google Sans Text" w:hAnsi="Google Sans Text" w:cs="Google Sans Text"/>
+          <w:color w:val="1B1C1D"/>
+          <w:sz w:val="24"/>
+          <w:szCs w:val="24"/>
+        </w:rPr>
+        <w:t>Shall be able to update existing genre details. (API: PUT /</w:t>
       </w:r>
       <w:proofErr w:type="spellStart"/>
       <w:r>
@@ -5186,27 +4859,7 @@
           <w:sz w:val="24"/>
           <w:szCs w:val="24"/>
         </w:rPr>
-        <w:t>/genre/</w:t>
-      </w:r>
-      <w:proofErr w:type="gramStart"/>
-      <w:r>
-        <w:rPr>
-          <w:rFonts w:ascii="Google Sans Text" w:eastAsia="Google Sans Text" w:hAnsi="Google Sans Text" w:cs="Google Sans Text"/>
-          <w:color w:val="1B1C1D"/>
-          <w:sz w:val="24"/>
-          <w:szCs w:val="24"/>
-        </w:rPr>
-        <w:t>update/:</w:t>
-      </w:r>
-      <w:proofErr w:type="gramEnd"/>
-      <w:r>
-        <w:rPr>
-          <w:rFonts w:ascii="Google Sans Text" w:eastAsia="Google Sans Text" w:hAnsi="Google Sans Text" w:cs="Google Sans Text"/>
-          <w:color w:val="1B1C1D"/>
-          <w:sz w:val="24"/>
-          <w:szCs w:val="24"/>
-        </w:rPr>
-        <w:t>id)</w:t>
+        <w:t>/genre/update/:id)</w:t>
       </w:r>
     </w:p>
     <w:p>
@@ -5224,25 +4877,14 @@
         </w:pBdr>
         <w:spacing w:line="275" w:lineRule="auto"/>
       </w:pPr>
-      <w:proofErr w:type="gramStart"/>
-      <w:r>
-        <w:rPr>
-          <w:rFonts w:ascii="Google Sans Text" w:eastAsia="Google Sans Text" w:hAnsi="Google Sans Text" w:cs="Google Sans Text"/>
-          <w:color w:val="1B1C1D"/>
-          <w:sz w:val="24"/>
-          <w:szCs w:val="24"/>
-        </w:rPr>
-        <w:t>Shall</w:t>
-      </w:r>
-      <w:proofErr w:type="gramEnd"/>
-      <w:r>
-        <w:rPr>
-          <w:rFonts w:ascii="Google Sans Text" w:eastAsia="Google Sans Text" w:hAnsi="Google Sans Text" w:cs="Google Sans Text"/>
-          <w:color w:val="1B1C1D"/>
-          <w:sz w:val="24"/>
-          <w:szCs w:val="24"/>
-        </w:rPr>
-        <w:t xml:space="preserve"> be able to delete genres. (API: DELETE /</w:t>
+      <w:r>
+        <w:rPr>
+          <w:rFonts w:ascii="Google Sans Text" w:eastAsia="Google Sans Text" w:hAnsi="Google Sans Text" w:cs="Google Sans Text"/>
+          <w:color w:val="1B1C1D"/>
+          <w:sz w:val="24"/>
+          <w:szCs w:val="24"/>
+        </w:rPr>
+        <w:t>Shall be able to delete genres. (API: DELETE /</w:t>
       </w:r>
       <w:proofErr w:type="spellStart"/>
       <w:r>
@@ -5326,25 +4968,14 @@
         </w:pBdr>
         <w:spacing w:line="275" w:lineRule="auto"/>
       </w:pPr>
-      <w:proofErr w:type="gramStart"/>
-      <w:r>
-        <w:rPr>
-          <w:rFonts w:ascii="Google Sans Text" w:eastAsia="Google Sans Text" w:hAnsi="Google Sans Text" w:cs="Google Sans Text"/>
-          <w:color w:val="1B1C1D"/>
-          <w:sz w:val="24"/>
-          <w:szCs w:val="24"/>
-        </w:rPr>
-        <w:t>Shall</w:t>
-      </w:r>
-      <w:proofErr w:type="gramEnd"/>
-      <w:r>
-        <w:rPr>
-          <w:rFonts w:ascii="Google Sans Text" w:eastAsia="Google Sans Text" w:hAnsi="Google Sans Text" w:cs="Google Sans Text"/>
-          <w:color w:val="1B1C1D"/>
-          <w:sz w:val="24"/>
-          <w:szCs w:val="24"/>
-        </w:rPr>
-        <w:t xml:space="preserve"> be able to view a list of all genres.</w:t>
+      <w:r>
+        <w:rPr>
+          <w:rFonts w:ascii="Google Sans Text" w:eastAsia="Google Sans Text" w:hAnsi="Google Sans Text" w:cs="Google Sans Text"/>
+          <w:color w:val="1B1C1D"/>
+          <w:sz w:val="24"/>
+          <w:szCs w:val="24"/>
+        </w:rPr>
+        <w:t>Shall be able to view a list of all genres.</w:t>
       </w:r>
     </w:p>
     <w:p>
@@ -5362,25 +4993,14 @@
         </w:pBdr>
         <w:spacing w:line="275" w:lineRule="auto"/>
       </w:pPr>
-      <w:proofErr w:type="gramStart"/>
-      <w:r>
-        <w:rPr>
-          <w:rFonts w:ascii="Google Sans Text" w:eastAsia="Google Sans Text" w:hAnsi="Google Sans Text" w:cs="Google Sans Text"/>
-          <w:color w:val="1B1C1D"/>
-          <w:sz w:val="24"/>
-          <w:szCs w:val="24"/>
-        </w:rPr>
-        <w:t>Shall</w:t>
-      </w:r>
-      <w:proofErr w:type="gramEnd"/>
-      <w:r>
-        <w:rPr>
-          <w:rFonts w:ascii="Google Sans Text" w:eastAsia="Google Sans Text" w:hAnsi="Google Sans Text" w:cs="Google Sans Text"/>
-          <w:color w:val="1B1C1D"/>
-          <w:sz w:val="24"/>
-          <w:szCs w:val="24"/>
-        </w:rPr>
-        <w:t xml:space="preserve"> be able to view details of a specific genre.</w:t>
+      <w:r>
+        <w:rPr>
+          <w:rFonts w:ascii="Google Sans Text" w:eastAsia="Google Sans Text" w:hAnsi="Google Sans Text" w:cs="Google Sans Text"/>
+          <w:color w:val="1B1C1D"/>
+          <w:sz w:val="24"/>
+          <w:szCs w:val="24"/>
+        </w:rPr>
+        <w:t>Shall be able to view details of a specific genre.</w:t>
       </w:r>
     </w:p>
     <w:p>
@@ -5590,25 +5210,14 @@
         </w:pBdr>
         <w:spacing w:line="275" w:lineRule="auto"/>
       </w:pPr>
-      <w:proofErr w:type="gramStart"/>
-      <w:r>
-        <w:rPr>
-          <w:rFonts w:ascii="Google Sans Text" w:eastAsia="Google Sans Text" w:hAnsi="Google Sans Text" w:cs="Google Sans Text"/>
-          <w:color w:val="1B1C1D"/>
-          <w:sz w:val="24"/>
-          <w:szCs w:val="24"/>
-        </w:rPr>
-        <w:t>Shall</w:t>
-      </w:r>
-      <w:proofErr w:type="gramEnd"/>
-      <w:r>
-        <w:rPr>
-          <w:rFonts w:ascii="Google Sans Text" w:eastAsia="Google Sans Text" w:hAnsi="Google Sans Text" w:cs="Google Sans Text"/>
-          <w:color w:val="1B1C1D"/>
-          <w:sz w:val="24"/>
-          <w:szCs w:val="24"/>
-        </w:rPr>
-        <w:t xml:space="preserve"> be able to add new </w:t>
+      <w:r>
+        <w:rPr>
+          <w:rFonts w:ascii="Google Sans Text" w:eastAsia="Google Sans Text" w:hAnsi="Google Sans Text" w:cs="Google Sans Text"/>
+          <w:color w:val="1B1C1D"/>
+          <w:sz w:val="24"/>
+          <w:szCs w:val="24"/>
+        </w:rPr>
+        <w:t xml:space="preserve">Shall be able to add new </w:t>
       </w:r>
       <w:proofErr w:type="spellStart"/>
       <w:r>
@@ -5668,27 +5277,7 @@
           <w:sz w:val="24"/>
           <w:szCs w:val="24"/>
         </w:rPr>
-        <w:t>/</w:t>
-      </w:r>
-      <w:proofErr w:type="gramStart"/>
-      <w:r>
-        <w:rPr>
-          <w:rFonts w:ascii="Google Sans Text" w:eastAsia="Google Sans Text" w:hAnsi="Google Sans Text" w:cs="Google Sans Text"/>
-          <w:color w:val="1B1C1D"/>
-          <w:sz w:val="24"/>
-          <w:szCs w:val="24"/>
-        </w:rPr>
-        <w:t>add</w:t>
-      </w:r>
-      <w:proofErr w:type="gramEnd"/>
-      <w:r>
-        <w:rPr>
-          <w:rFonts w:ascii="Google Sans Text" w:eastAsia="Google Sans Text" w:hAnsi="Google Sans Text" w:cs="Google Sans Text"/>
-          <w:color w:val="1B1C1D"/>
-          <w:sz w:val="24"/>
-          <w:szCs w:val="24"/>
-        </w:rPr>
-        <w:t>)</w:t>
+        <w:t>/add)</w:t>
       </w:r>
     </w:p>
     <w:p>
@@ -5706,25 +5295,14 @@
         </w:pBdr>
         <w:spacing w:line="275" w:lineRule="auto"/>
       </w:pPr>
-      <w:proofErr w:type="gramStart"/>
-      <w:r>
-        <w:rPr>
-          <w:rFonts w:ascii="Google Sans Text" w:eastAsia="Google Sans Text" w:hAnsi="Google Sans Text" w:cs="Google Sans Text"/>
-          <w:color w:val="1B1C1D"/>
-          <w:sz w:val="24"/>
-          <w:szCs w:val="24"/>
-        </w:rPr>
-        <w:t>Shall</w:t>
-      </w:r>
-      <w:proofErr w:type="gramEnd"/>
-      <w:r>
-        <w:rPr>
-          <w:rFonts w:ascii="Google Sans Text" w:eastAsia="Google Sans Text" w:hAnsi="Google Sans Text" w:cs="Google Sans Text"/>
-          <w:color w:val="1B1C1D"/>
-          <w:sz w:val="24"/>
-          <w:szCs w:val="24"/>
-        </w:rPr>
-        <w:t xml:space="preserve"> be able to view a list of all </w:t>
+      <w:r>
+        <w:rPr>
+          <w:rFonts w:ascii="Google Sans Text" w:eastAsia="Google Sans Text" w:hAnsi="Google Sans Text" w:cs="Google Sans Text"/>
+          <w:color w:val="1B1C1D"/>
+          <w:sz w:val="24"/>
+          <w:szCs w:val="24"/>
+        </w:rPr>
+        <w:t xml:space="preserve">Shall be able to view a list of all </w:t>
       </w:r>
       <w:proofErr w:type="spellStart"/>
       <w:r>
@@ -5822,25 +5400,14 @@
         </w:pBdr>
         <w:spacing w:line="275" w:lineRule="auto"/>
       </w:pPr>
-      <w:proofErr w:type="gramStart"/>
-      <w:r>
-        <w:rPr>
-          <w:rFonts w:ascii="Google Sans Text" w:eastAsia="Google Sans Text" w:hAnsi="Google Sans Text" w:cs="Google Sans Text"/>
-          <w:color w:val="1B1C1D"/>
-          <w:sz w:val="24"/>
-          <w:szCs w:val="24"/>
-        </w:rPr>
-        <w:t>Shall</w:t>
-      </w:r>
-      <w:proofErr w:type="gramEnd"/>
-      <w:r>
-        <w:rPr>
-          <w:rFonts w:ascii="Google Sans Text" w:eastAsia="Google Sans Text" w:hAnsi="Google Sans Text" w:cs="Google Sans Text"/>
-          <w:color w:val="1B1C1D"/>
-          <w:sz w:val="24"/>
-          <w:szCs w:val="24"/>
-        </w:rPr>
-        <w:t xml:space="preserve"> be able to view details of a specific </w:t>
+      <w:r>
+        <w:rPr>
+          <w:rFonts w:ascii="Google Sans Text" w:eastAsia="Google Sans Text" w:hAnsi="Google Sans Text" w:cs="Google Sans Text"/>
+          <w:color w:val="1B1C1D"/>
+          <w:sz w:val="24"/>
+          <w:szCs w:val="24"/>
+        </w:rPr>
+        <w:t xml:space="preserve">Shall be able to view details of a specific </w:t>
       </w:r>
       <w:proofErr w:type="spellStart"/>
       <w:r>
@@ -6014,25 +5581,14 @@
         </w:pBdr>
         <w:spacing w:line="275" w:lineRule="auto"/>
       </w:pPr>
-      <w:proofErr w:type="gramStart"/>
-      <w:r>
-        <w:rPr>
-          <w:rFonts w:ascii="Google Sans Text" w:eastAsia="Google Sans Text" w:hAnsi="Google Sans Text" w:cs="Google Sans Text"/>
-          <w:color w:val="1B1C1D"/>
-          <w:sz w:val="24"/>
-          <w:szCs w:val="24"/>
-        </w:rPr>
-        <w:t>Shall</w:t>
-      </w:r>
-      <w:proofErr w:type="gramEnd"/>
-      <w:r>
-        <w:rPr>
-          <w:rFonts w:ascii="Google Sans Text" w:eastAsia="Google Sans Text" w:hAnsi="Google Sans Text" w:cs="Google Sans Text"/>
-          <w:color w:val="1B1C1D"/>
-          <w:sz w:val="24"/>
-          <w:szCs w:val="24"/>
-        </w:rPr>
-        <w:t xml:space="preserve"> be able to delete </w:t>
+      <w:r>
+        <w:rPr>
+          <w:rFonts w:ascii="Google Sans Text" w:eastAsia="Google Sans Text" w:hAnsi="Google Sans Text" w:cs="Google Sans Text"/>
+          <w:color w:val="1B1C1D"/>
+          <w:sz w:val="24"/>
+          <w:szCs w:val="24"/>
+        </w:rPr>
+        <w:t xml:space="preserve">Shall be able to delete </w:t>
       </w:r>
       <w:proofErr w:type="spellStart"/>
       <w:r>
@@ -6252,25 +5808,14 @@
         </w:pBdr>
         <w:spacing w:line="275" w:lineRule="auto"/>
       </w:pPr>
-      <w:proofErr w:type="gramStart"/>
-      <w:r>
-        <w:rPr>
-          <w:rFonts w:ascii="Google Sans Text" w:eastAsia="Google Sans Text" w:hAnsi="Google Sans Text" w:cs="Google Sans Text"/>
-          <w:color w:val="1B1C1D"/>
-          <w:sz w:val="24"/>
-          <w:szCs w:val="24"/>
-        </w:rPr>
-        <w:t>Shall</w:t>
-      </w:r>
-      <w:proofErr w:type="gramEnd"/>
-      <w:r>
-        <w:rPr>
-          <w:rFonts w:ascii="Google Sans Text" w:eastAsia="Google Sans Text" w:hAnsi="Google Sans Text" w:cs="Google Sans Text"/>
-          <w:color w:val="1B1C1D"/>
-          <w:sz w:val="24"/>
-          <w:szCs w:val="24"/>
-        </w:rPr>
-        <w:t xml:space="preserve"> be able to view their own </w:t>
+      <w:r>
+        <w:rPr>
+          <w:rFonts w:ascii="Google Sans Text" w:eastAsia="Google Sans Text" w:hAnsi="Google Sans Text" w:cs="Google Sans Text"/>
+          <w:color w:val="1B1C1D"/>
+          <w:sz w:val="24"/>
+          <w:szCs w:val="24"/>
+        </w:rPr>
+        <w:t xml:space="preserve">Shall be able to view their own </w:t>
       </w:r>
       <w:proofErr w:type="spellStart"/>
       <w:r>
@@ -6551,25 +6096,14 @@
         </w:pBdr>
         <w:spacing w:line="275" w:lineRule="auto"/>
       </w:pPr>
-      <w:proofErr w:type="gramStart"/>
-      <w:r>
-        <w:rPr>
-          <w:rFonts w:ascii="Google Sans Text" w:eastAsia="Google Sans Text" w:hAnsi="Google Sans Text" w:cs="Google Sans Text"/>
-          <w:color w:val="1B1C1D"/>
-          <w:sz w:val="24"/>
-          <w:szCs w:val="24"/>
-        </w:rPr>
-        <w:t>Shall</w:t>
-      </w:r>
-      <w:proofErr w:type="gramEnd"/>
-      <w:r>
-        <w:rPr>
-          <w:rFonts w:ascii="Google Sans Text" w:eastAsia="Google Sans Text" w:hAnsi="Google Sans Text" w:cs="Google Sans Text"/>
-          <w:color w:val="1B1C1D"/>
-          <w:sz w:val="24"/>
-          <w:szCs w:val="24"/>
-        </w:rPr>
-        <w:t xml:space="preserve"> be able to add new users (Librarians or Members). (API: POST /</w:t>
+      <w:r>
+        <w:rPr>
+          <w:rFonts w:ascii="Google Sans Text" w:eastAsia="Google Sans Text" w:hAnsi="Google Sans Text" w:cs="Google Sans Text"/>
+          <w:color w:val="1B1C1D"/>
+          <w:sz w:val="24"/>
+          <w:szCs w:val="24"/>
+        </w:rPr>
+        <w:t>Shall be able to add new users (Librarians or Members). (API: POST /</w:t>
       </w:r>
       <w:proofErr w:type="spellStart"/>
       <w:r>
@@ -6627,7 +6161,6 @@
         </w:pBdr>
         <w:spacing w:line="275" w:lineRule="auto"/>
       </w:pPr>
-      <w:proofErr w:type="gramStart"/>
       <w:r>
         <w:rPr>
           <w:rFonts w:ascii="Google Sans Text" w:eastAsia="Google Sans Text" w:hAnsi="Google Sans Text" w:cs="Google Sans Text"/>
@@ -6636,17 +6169,7 @@
           <w:szCs w:val="24"/>
         </w:rPr>
         <w:lastRenderedPageBreak/>
-        <w:t>Shall</w:t>
-      </w:r>
-      <w:proofErr w:type="gramEnd"/>
-      <w:r>
-        <w:rPr>
-          <w:rFonts w:ascii="Google Sans Text" w:eastAsia="Google Sans Text" w:hAnsi="Google Sans Text" w:cs="Google Sans Text"/>
-          <w:color w:val="1B1C1D"/>
-          <w:sz w:val="24"/>
-          <w:szCs w:val="24"/>
-        </w:rPr>
-        <w:t xml:space="preserve"> be able to view a list of all users. (API: GET /</w:t>
+        <w:t>Shall be able to view a list of all users. (API: GET /</w:t>
       </w:r>
       <w:proofErr w:type="spellStart"/>
       <w:r>
@@ -6704,25 +6227,14 @@
         </w:pBdr>
         <w:spacing w:line="275" w:lineRule="auto"/>
       </w:pPr>
-      <w:proofErr w:type="gramStart"/>
-      <w:r>
-        <w:rPr>
-          <w:rFonts w:ascii="Google Sans Text" w:eastAsia="Google Sans Text" w:hAnsi="Google Sans Text" w:cs="Google Sans Text"/>
-          <w:color w:val="1B1C1D"/>
-          <w:sz w:val="24"/>
-          <w:szCs w:val="24"/>
-        </w:rPr>
-        <w:t>Shall</w:t>
-      </w:r>
-      <w:proofErr w:type="gramEnd"/>
-      <w:r>
-        <w:rPr>
-          <w:rFonts w:ascii="Google Sans Text" w:eastAsia="Google Sans Text" w:hAnsi="Google Sans Text" w:cs="Google Sans Text"/>
-          <w:color w:val="1B1C1D"/>
-          <w:sz w:val="24"/>
-          <w:szCs w:val="24"/>
-        </w:rPr>
-        <w:t xml:space="preserve"> be able to view a list of all members (users with </w:t>
+      <w:r>
+        <w:rPr>
+          <w:rFonts w:ascii="Google Sans Text" w:eastAsia="Google Sans Text" w:hAnsi="Google Sans Text" w:cs="Google Sans Text"/>
+          <w:color w:val="1B1C1D"/>
+          <w:sz w:val="24"/>
+          <w:szCs w:val="24"/>
+        </w:rPr>
+        <w:t xml:space="preserve">Shall be able to view a list of all members (users with </w:t>
       </w:r>
       <w:proofErr w:type="spellStart"/>
       <w:r>
@@ -7015,6 +6527,24 @@
         </w:rPr>
         <w:t>3.8. Review Management</w:t>
       </w:r>
+      <w:r>
+        <w:rPr>
+          <w:rFonts w:ascii="Google Sans" w:eastAsia="Google Sans" w:hAnsi="Google Sans" w:cs="Google Sans"/>
+          <w:color w:val="1B1C1D"/>
+          <w:sz w:val="24"/>
+          <w:szCs w:val="24"/>
+        </w:rPr>
+        <w:t xml:space="preserve"> </w:t>
+      </w:r>
+      <w:r>
+        <w:rPr>
+          <w:rFonts w:ascii="Google Sans" w:eastAsia="Google Sans" w:hAnsi="Google Sans" w:cs="Google Sans"/>
+          <w:color w:val="1B1C1D"/>
+          <w:sz w:val="24"/>
+          <w:szCs w:val="24"/>
+        </w:rPr>
+        <w:t>(New Feature)</w:t>
+      </w:r>
     </w:p>
     <w:p>
       <w:pPr>
@@ -7048,7 +6578,27 @@
           <w:sz w:val="24"/>
           <w:szCs w:val="24"/>
         </w:rPr>
-        <w:t xml:space="preserve"> The system shall allow management of book reviews. (Note: Client-side UI for review submission/display by members is not explicitly detailed in the provided page components, but backend infrastructure exists.)</w:t>
+        <w:t xml:space="preserve"> </w:t>
+      </w:r>
+      <w:r>
+        <w:rPr>
+          <w:rFonts w:ascii="Google Sans Text" w:eastAsia="Google Sans Text" w:hAnsi="Google Sans Text" w:cs="Google Sans Text"/>
+          <w:color w:val="1B1C1D"/>
+          <w:sz w:val="24"/>
+          <w:szCs w:val="24"/>
+        </w:rPr>
+        <w:t xml:space="preserve">The system shall allow authenticated members to submit reviews for books and librarians to manage all reviews. </w:t>
+      </w:r>
+      <w:r>
+        <w:rPr>
+          <w:rFonts w:ascii="Google Sans Text" w:eastAsia="Google Sans Text" w:hAnsi="Google Sans Text" w:cs="Google Sans Text"/>
+          <w:b/>
+          <w:bCs/>
+          <w:color w:val="1B1C1D"/>
+          <w:sz w:val="24"/>
+          <w:szCs w:val="24"/>
+        </w:rPr>
+        <w:t>(New Feature)</w:t>
       </w:r>
     </w:p>
     <w:p>
@@ -7083,7 +6633,58 @@
           <w:sz w:val="24"/>
           <w:szCs w:val="24"/>
         </w:rPr>
-        <w:t xml:space="preserve"> Book ID, Star rating, Rating text.</w:t>
+        <w:t xml:space="preserve"> </w:t>
+      </w:r>
+      <w:proofErr w:type="spellStart"/>
+      <w:r>
+        <w:rPr>
+          <w:rFonts w:ascii="Google Sans Text" w:eastAsia="Google Sans Text" w:hAnsi="Google Sans Text" w:cs="Google Sans Text"/>
+          <w:color w:val="1B1C1D"/>
+          <w:sz w:val="24"/>
+          <w:szCs w:val="24"/>
+        </w:rPr>
+        <w:t>bookId</w:t>
+      </w:r>
+      <w:proofErr w:type="spellEnd"/>
+      <w:r>
+        <w:rPr>
+          <w:rFonts w:ascii="Google Sans Text" w:eastAsia="Google Sans Text" w:hAnsi="Google Sans Text" w:cs="Google Sans Text"/>
+          <w:color w:val="1B1C1D"/>
+          <w:sz w:val="24"/>
+          <w:szCs w:val="24"/>
+        </w:rPr>
+        <w:t xml:space="preserve">, </w:t>
+      </w:r>
+      <w:proofErr w:type="spellStart"/>
+      <w:r>
+        <w:rPr>
+          <w:rFonts w:ascii="Google Sans Text" w:eastAsia="Google Sans Text" w:hAnsi="Google Sans Text" w:cs="Google Sans Text"/>
+          <w:color w:val="1B1C1D"/>
+          <w:sz w:val="24"/>
+          <w:szCs w:val="24"/>
+        </w:rPr>
+        <w:t>memberId</w:t>
+      </w:r>
+      <w:proofErr w:type="spellEnd"/>
+      <w:r>
+        <w:rPr>
+          <w:rFonts w:ascii="Google Sans Text" w:eastAsia="Google Sans Text" w:hAnsi="Google Sans Text" w:cs="Google Sans Text"/>
+          <w:color w:val="1B1C1D"/>
+          <w:sz w:val="24"/>
+          <w:szCs w:val="24"/>
+        </w:rPr>
+        <w:t xml:space="preserve">, rating, comment. </w:t>
+      </w:r>
+      <w:r>
+        <w:rPr>
+          <w:rFonts w:ascii="Google Sans Text" w:eastAsia="Google Sans Text" w:hAnsi="Google Sans Text" w:cs="Google Sans Text"/>
+          <w:b/>
+          <w:bCs/>
+          <w:color w:val="1B1C1D"/>
+          <w:sz w:val="24"/>
+          <w:szCs w:val="24"/>
+        </w:rPr>
+        <w:t>(New Feature)</w:t>
       </w:r>
     </w:p>
     <w:p>
@@ -7109,7 +6710,27 @@
           <w:sz w:val="24"/>
           <w:szCs w:val="24"/>
         </w:rPr>
-        <w:t>Librarian Functions (Assumed based on CRUD API):</w:t>
+        <w:t xml:space="preserve">Librarian Functions </w:t>
+      </w:r>
+      <w:r>
+        <w:rPr>
+          <w:rFonts w:ascii="Google Sans Text" w:eastAsia="Google Sans Text" w:hAnsi="Google Sans Text" w:cs="Google Sans Text"/>
+          <w:b/>
+          <w:color w:val="1B1C1D"/>
+          <w:sz w:val="24"/>
+          <w:szCs w:val="24"/>
+        </w:rPr>
+        <w:t>(New Feature)</w:t>
+      </w:r>
+      <w:r>
+        <w:rPr>
+          <w:rFonts w:ascii="Google Sans Text" w:eastAsia="Google Sans Text" w:hAnsi="Google Sans Text" w:cs="Google Sans Text"/>
+          <w:b/>
+          <w:color w:val="1B1C1D"/>
+          <w:sz w:val="24"/>
+          <w:szCs w:val="24"/>
+        </w:rPr>
+        <w:t>:</w:t>
       </w:r>
     </w:p>
     <w:p>
@@ -7127,25 +6748,14 @@
         </w:pBdr>
         <w:spacing w:line="275" w:lineRule="auto"/>
       </w:pPr>
-      <w:proofErr w:type="gramStart"/>
-      <w:r>
-        <w:rPr>
-          <w:rFonts w:ascii="Google Sans Text" w:eastAsia="Google Sans Text" w:hAnsi="Google Sans Text" w:cs="Google Sans Text"/>
-          <w:color w:val="1B1C1D"/>
-          <w:sz w:val="24"/>
-          <w:szCs w:val="24"/>
-        </w:rPr>
-        <w:t>Shall</w:t>
-      </w:r>
-      <w:proofErr w:type="gramEnd"/>
-      <w:r>
-        <w:rPr>
-          <w:rFonts w:ascii="Google Sans Text" w:eastAsia="Google Sans Text" w:hAnsi="Google Sans Text" w:cs="Google Sans Text"/>
-          <w:color w:val="1B1C1D"/>
-          <w:sz w:val="24"/>
-          <w:szCs w:val="24"/>
-        </w:rPr>
-        <w:t xml:space="preserve"> be able to add reviews (potentially administrative). (API: POST /</w:t>
+      <w:r>
+        <w:rPr>
+          <w:rFonts w:ascii="Google Sans Text" w:eastAsia="Google Sans Text" w:hAnsi="Google Sans Text" w:cs="Google Sans Text"/>
+          <w:color w:val="1B1C1D"/>
+          <w:sz w:val="24"/>
+          <w:szCs w:val="24"/>
+        </w:rPr>
+        <w:t>Shall be able to view a list of all reviews in the system. (API: GET /</w:t>
       </w:r>
       <w:proofErr w:type="spellStart"/>
       <w:r>
@@ -7165,7 +6775,27 @@
           <w:sz w:val="24"/>
           <w:szCs w:val="24"/>
         </w:rPr>
-        <w:t>/review/add)</w:t>
+        <w:t>/review/</w:t>
+      </w:r>
+      <w:proofErr w:type="spellStart"/>
+      <w:r>
+        <w:rPr>
+          <w:rFonts w:ascii="Google Sans Text" w:eastAsia="Google Sans Text" w:hAnsi="Google Sans Text" w:cs="Google Sans Text"/>
+          <w:color w:val="1B1C1D"/>
+          <w:sz w:val="24"/>
+          <w:szCs w:val="24"/>
+        </w:rPr>
+        <w:t>getAll</w:t>
+      </w:r>
+      <w:proofErr w:type="spellEnd"/>
+      <w:r>
+        <w:rPr>
+          <w:rFonts w:ascii="Google Sans Text" w:eastAsia="Google Sans Text" w:hAnsi="Google Sans Text" w:cs="Google Sans Text"/>
+          <w:color w:val="1B1C1D"/>
+          <w:sz w:val="24"/>
+          <w:szCs w:val="24"/>
+        </w:rPr>
+        <w:t>)</w:t>
       </w:r>
     </w:p>
     <w:p>
@@ -7183,6 +6813,35 @@
         </w:pBdr>
         <w:spacing w:line="275" w:lineRule="auto"/>
       </w:pPr>
+      <w:r>
+        <w:rPr>
+          <w:rFonts w:ascii="Google Sans Text" w:eastAsia="Google Sans Text" w:hAnsi="Google Sans Text" w:cs="Google Sans Text"/>
+          <w:color w:val="1B1C1D"/>
+          <w:sz w:val="24"/>
+          <w:szCs w:val="24"/>
+        </w:rPr>
+        <w:t>Shall be able to view the details of a specific review. (API: GET /</w:t>
+      </w:r>
+      <w:proofErr w:type="spellStart"/>
+      <w:r>
+        <w:rPr>
+          <w:rFonts w:ascii="Google Sans Text" w:eastAsia="Google Sans Text" w:hAnsi="Google Sans Text" w:cs="Google Sans Text"/>
+          <w:color w:val="1B1C1D"/>
+          <w:sz w:val="24"/>
+          <w:szCs w:val="24"/>
+        </w:rPr>
+        <w:t>api</w:t>
+      </w:r>
+      <w:proofErr w:type="spellEnd"/>
+      <w:r>
+        <w:rPr>
+          <w:rFonts w:ascii="Google Sans Text" w:eastAsia="Google Sans Text" w:hAnsi="Google Sans Text" w:cs="Google Sans Text"/>
+          <w:color w:val="1B1C1D"/>
+          <w:sz w:val="24"/>
+          <w:szCs w:val="24"/>
+        </w:rPr>
+        <w:t>/review</w:t>
+      </w:r>
       <w:proofErr w:type="gramStart"/>
       <w:r>
         <w:rPr>
@@ -7191,7 +6850,7 @@
           <w:sz w:val="24"/>
           <w:szCs w:val="24"/>
         </w:rPr>
-        <w:t>Shall</w:t>
+        <w:t>/get/:</w:t>
       </w:r>
       <w:proofErr w:type="gramEnd"/>
       <w:r>
@@ -7201,47 +6860,7 @@
           <w:sz w:val="24"/>
           <w:szCs w:val="24"/>
         </w:rPr>
-        <w:t xml:space="preserve"> be able to view all reviews. (API: GET /</w:t>
-      </w:r>
-      <w:proofErr w:type="spellStart"/>
-      <w:r>
-        <w:rPr>
-          <w:rFonts w:ascii="Google Sans Text" w:eastAsia="Google Sans Text" w:hAnsi="Google Sans Text" w:cs="Google Sans Text"/>
-          <w:color w:val="1B1C1D"/>
-          <w:sz w:val="24"/>
-          <w:szCs w:val="24"/>
-        </w:rPr>
-        <w:t>api</w:t>
-      </w:r>
-      <w:proofErr w:type="spellEnd"/>
-      <w:r>
-        <w:rPr>
-          <w:rFonts w:ascii="Google Sans Text" w:eastAsia="Google Sans Text" w:hAnsi="Google Sans Text" w:cs="Google Sans Text"/>
-          <w:color w:val="1B1C1D"/>
-          <w:sz w:val="24"/>
-          <w:szCs w:val="24"/>
-        </w:rPr>
-        <w:t>/review/</w:t>
-      </w:r>
-      <w:proofErr w:type="spellStart"/>
-      <w:r>
-        <w:rPr>
-          <w:rFonts w:ascii="Google Sans Text" w:eastAsia="Google Sans Text" w:hAnsi="Google Sans Text" w:cs="Google Sans Text"/>
-          <w:color w:val="1B1C1D"/>
-          <w:sz w:val="24"/>
-          <w:szCs w:val="24"/>
-        </w:rPr>
-        <w:t>getAll</w:t>
-      </w:r>
-      <w:proofErr w:type="spellEnd"/>
-      <w:r>
-        <w:rPr>
-          <w:rFonts w:ascii="Google Sans Text" w:eastAsia="Google Sans Text" w:hAnsi="Google Sans Text" w:cs="Google Sans Text"/>
-          <w:color w:val="1B1C1D"/>
-          <w:sz w:val="24"/>
-          <w:szCs w:val="24"/>
-        </w:rPr>
-        <w:t>)</w:t>
+        <w:t>id)</w:t>
       </w:r>
     </w:p>
     <w:p>
@@ -7259,6 +6878,35 @@
         </w:pBdr>
         <w:spacing w:line="275" w:lineRule="auto"/>
       </w:pPr>
+      <w:r>
+        <w:rPr>
+          <w:rFonts w:ascii="Google Sans Text" w:eastAsia="Google Sans Text" w:hAnsi="Google Sans Text" w:cs="Google Sans Text"/>
+          <w:color w:val="1B1C1D"/>
+          <w:sz w:val="24"/>
+          <w:szCs w:val="24"/>
+        </w:rPr>
+        <w:t>Shall be able to delete any review. (API: DELETE /</w:t>
+      </w:r>
+      <w:proofErr w:type="spellStart"/>
+      <w:r>
+        <w:rPr>
+          <w:rFonts w:ascii="Google Sans Text" w:eastAsia="Google Sans Text" w:hAnsi="Google Sans Text" w:cs="Google Sans Text"/>
+          <w:color w:val="1B1C1D"/>
+          <w:sz w:val="24"/>
+          <w:szCs w:val="24"/>
+        </w:rPr>
+        <w:t>api</w:t>
+      </w:r>
+      <w:proofErr w:type="spellEnd"/>
+      <w:r>
+        <w:rPr>
+          <w:rFonts w:ascii="Google Sans Text" w:eastAsia="Google Sans Text" w:hAnsi="Google Sans Text" w:cs="Google Sans Text"/>
+          <w:color w:val="1B1C1D"/>
+          <w:sz w:val="24"/>
+          <w:szCs w:val="24"/>
+        </w:rPr>
+        <w:t>/review</w:t>
+      </w:r>
       <w:proofErr w:type="gramStart"/>
       <w:r>
         <w:rPr>
@@ -7267,7 +6915,7 @@
           <w:sz w:val="24"/>
           <w:szCs w:val="24"/>
         </w:rPr>
-        <w:t>Shall</w:t>
+        <w:t>/delete/:</w:t>
       </w:r>
       <w:proofErr w:type="gramEnd"/>
       <w:r>
@@ -7277,47 +6925,53 @@
           <w:sz w:val="24"/>
           <w:szCs w:val="24"/>
         </w:rPr>
-        <w:t xml:space="preserve"> be able to view a specific review. (API: GET /</w:t>
-      </w:r>
-      <w:proofErr w:type="spellStart"/>
-      <w:r>
-        <w:rPr>
-          <w:rFonts w:ascii="Google Sans Text" w:eastAsia="Google Sans Text" w:hAnsi="Google Sans Text" w:cs="Google Sans Text"/>
-          <w:color w:val="1B1C1D"/>
-          <w:sz w:val="24"/>
-          <w:szCs w:val="24"/>
-        </w:rPr>
-        <w:t>api</w:t>
-      </w:r>
-      <w:proofErr w:type="spellEnd"/>
-      <w:r>
-        <w:rPr>
-          <w:rFonts w:ascii="Google Sans Text" w:eastAsia="Google Sans Text" w:hAnsi="Google Sans Text" w:cs="Google Sans Text"/>
-          <w:color w:val="1B1C1D"/>
-          <w:sz w:val="24"/>
-          <w:szCs w:val="24"/>
-        </w:rPr>
-        <w:t>/review</w:t>
-      </w:r>
-      <w:proofErr w:type="gramStart"/>
-      <w:r>
-        <w:rPr>
-          <w:rFonts w:ascii="Google Sans Text" w:eastAsia="Google Sans Text" w:hAnsi="Google Sans Text" w:cs="Google Sans Text"/>
-          <w:color w:val="1B1C1D"/>
-          <w:sz w:val="24"/>
-          <w:szCs w:val="24"/>
-        </w:rPr>
-        <w:t>/get/:</w:t>
-      </w:r>
-      <w:proofErr w:type="gramEnd"/>
-      <w:r>
-        <w:rPr>
-          <w:rFonts w:ascii="Google Sans Text" w:eastAsia="Google Sans Text" w:hAnsi="Google Sans Text" w:cs="Google Sans Text"/>
-          <w:color w:val="1B1C1D"/>
-          <w:sz w:val="24"/>
-          <w:szCs w:val="24"/>
-        </w:rPr>
         <w:t>id)</w:t>
+      </w:r>
+    </w:p>
+    <w:p>
+      <w:pPr>
+        <w:numPr>
+          <w:ilvl w:val="0"/>
+          <w:numId w:val="16"/>
+        </w:numPr>
+        <w:pBdr>
+          <w:top w:val="nil"/>
+          <w:left w:val="nil"/>
+          <w:bottom w:val="nil"/>
+          <w:right w:val="nil"/>
+          <w:between w:val="nil"/>
+        </w:pBdr>
+        <w:spacing w:line="275" w:lineRule="auto"/>
+      </w:pPr>
+      <w:r>
+        <w:rPr>
+          <w:rFonts w:ascii="Google Sans Text" w:eastAsia="Google Sans Text" w:hAnsi="Google Sans Text" w:cs="Google Sans Text"/>
+          <w:b/>
+          <w:color w:val="1B1C1D"/>
+          <w:sz w:val="24"/>
+          <w:szCs w:val="24"/>
+        </w:rPr>
+        <w:t xml:space="preserve">Member Functions </w:t>
+      </w:r>
+      <w:r>
+        <w:rPr>
+          <w:rFonts w:ascii="Google Sans Text" w:eastAsia="Google Sans Text" w:hAnsi="Google Sans Text" w:cs="Google Sans Text"/>
+          <w:b/>
+          <w:color w:val="1B1C1D"/>
+          <w:sz w:val="24"/>
+          <w:szCs w:val="24"/>
+        </w:rPr>
+        <w:t>(New Feature)</w:t>
+      </w:r>
+      <w:r>
+        <w:rPr>
+          <w:rFonts w:ascii="Google Sans Text" w:eastAsia="Google Sans Text" w:hAnsi="Google Sans Text" w:cs="Google Sans Text"/>
+          <w:b/>
+          <w:color w:val="1B1C1D"/>
+          <w:sz w:val="24"/>
+          <w:szCs w:val="24"/>
+        </w:rPr>
+        <w:t>:</w:t>
       </w:r>
     </w:p>
     <w:p>
@@ -7333,16 +6987,16 @@
           <w:right w:val="nil"/>
           <w:between w:val="nil"/>
         </w:pBdr>
-        <w:spacing w:line="275" w:lineRule="auto"/>
-      </w:pPr>
-      <w:r>
-        <w:rPr>
-          <w:rFonts w:ascii="Google Sans Text" w:eastAsia="Google Sans Text" w:hAnsi="Google Sans Text" w:cs="Google Sans Text"/>
-          <w:color w:val="1B1C1D"/>
-          <w:sz w:val="24"/>
-          <w:szCs w:val="24"/>
-        </w:rPr>
-        <w:t>Shall be able to update reviews. (API: PUT /</w:t>
+        <w:spacing w:after="120" w:line="275" w:lineRule="auto"/>
+      </w:pPr>
+      <w:r>
+        <w:rPr>
+          <w:rFonts w:ascii="Google Sans Text" w:eastAsia="Google Sans Text" w:hAnsi="Google Sans Text" w:cs="Google Sans Text"/>
+          <w:color w:val="1B1C1D"/>
+          <w:sz w:val="24"/>
+          <w:szCs w:val="24"/>
+        </w:rPr>
+        <w:t>Shall be able to add a new review for a book. The review is linked to the logged-in member's ID. (API: POST /</w:t>
       </w:r>
       <w:proofErr w:type="spellStart"/>
       <w:r>
@@ -7362,83 +7016,7 @@
           <w:sz w:val="24"/>
           <w:szCs w:val="24"/>
         </w:rPr>
-        <w:t>/review/update/:id)</w:t>
-      </w:r>
-    </w:p>
-    <w:p>
-      <w:pPr>
-        <w:numPr>
-          <w:ilvl w:val="1"/>
-          <w:numId w:val="16"/>
-        </w:numPr>
-        <w:pBdr>
-          <w:top w:val="nil"/>
-          <w:left w:val="nil"/>
-          <w:bottom w:val="nil"/>
-          <w:right w:val="nil"/>
-          <w:between w:val="nil"/>
-        </w:pBdr>
-        <w:spacing w:line="275" w:lineRule="auto"/>
-      </w:pPr>
-      <w:proofErr w:type="gramStart"/>
-      <w:r>
-        <w:rPr>
-          <w:rFonts w:ascii="Google Sans Text" w:eastAsia="Google Sans Text" w:hAnsi="Google Sans Text" w:cs="Google Sans Text"/>
-          <w:color w:val="1B1C1D"/>
-          <w:sz w:val="24"/>
-          <w:szCs w:val="24"/>
-        </w:rPr>
-        <w:t>Shall</w:t>
-      </w:r>
-      <w:proofErr w:type="gramEnd"/>
-      <w:r>
-        <w:rPr>
-          <w:rFonts w:ascii="Google Sans Text" w:eastAsia="Google Sans Text" w:hAnsi="Google Sans Text" w:cs="Google Sans Text"/>
-          <w:color w:val="1B1C1D"/>
-          <w:sz w:val="24"/>
-          <w:szCs w:val="24"/>
-        </w:rPr>
-        <w:t xml:space="preserve"> be able to delete reviews. (API: DELETE /</w:t>
-      </w:r>
-      <w:proofErr w:type="spellStart"/>
-      <w:r>
-        <w:rPr>
-          <w:rFonts w:ascii="Google Sans Text" w:eastAsia="Google Sans Text" w:hAnsi="Google Sans Text" w:cs="Google Sans Text"/>
-          <w:color w:val="1B1C1D"/>
-          <w:sz w:val="24"/>
-          <w:szCs w:val="24"/>
-        </w:rPr>
-        <w:t>api</w:t>
-      </w:r>
-      <w:proofErr w:type="spellEnd"/>
-      <w:r>
-        <w:rPr>
-          <w:rFonts w:ascii="Google Sans Text" w:eastAsia="Google Sans Text" w:hAnsi="Google Sans Text" w:cs="Google Sans Text"/>
-          <w:color w:val="1B1C1D"/>
-          <w:sz w:val="24"/>
-          <w:szCs w:val="24"/>
-        </w:rPr>
-        <w:t>/review</w:t>
-      </w:r>
-      <w:proofErr w:type="gramStart"/>
-      <w:r>
-        <w:rPr>
-          <w:rFonts w:ascii="Google Sans Text" w:eastAsia="Google Sans Text" w:hAnsi="Google Sans Text" w:cs="Google Sans Text"/>
-          <w:color w:val="1B1C1D"/>
-          <w:sz w:val="24"/>
-          <w:szCs w:val="24"/>
-        </w:rPr>
-        <w:t>/delete/:</w:t>
-      </w:r>
-      <w:proofErr w:type="gramEnd"/>
-      <w:r>
-        <w:rPr>
-          <w:rFonts w:ascii="Google Sans Text" w:eastAsia="Google Sans Text" w:hAnsi="Google Sans Text" w:cs="Google Sans Text"/>
-          <w:color w:val="1B1C1D"/>
-          <w:sz w:val="24"/>
-          <w:szCs w:val="24"/>
-        </w:rPr>
-        <w:t>id)</w:t>
+        <w:t>/review/add)</w:t>
       </w:r>
     </w:p>
     <w:p>
@@ -7464,32 +7042,37 @@
           <w:sz w:val="24"/>
           <w:szCs w:val="24"/>
         </w:rPr>
-        <w:t>Member Functions (Assumed capabilities if UI were present):</w:t>
-      </w:r>
-    </w:p>
-    <w:p>
-      <w:pPr>
-        <w:numPr>
-          <w:ilvl w:val="1"/>
-          <w:numId w:val="17"/>
-        </w:numPr>
-        <w:pBdr>
-          <w:top w:val="nil"/>
-          <w:left w:val="nil"/>
-          <w:bottom w:val="nil"/>
-          <w:right w:val="nil"/>
-          <w:between w:val="nil"/>
-        </w:pBdr>
-        <w:spacing w:line="275" w:lineRule="auto"/>
-      </w:pPr>
-      <w:r>
-        <w:rPr>
-          <w:rFonts w:ascii="Google Sans Text" w:eastAsia="Google Sans Text" w:hAnsi="Google Sans Text" w:cs="Google Sans Text"/>
-          <w:color w:val="1B1C1D"/>
-          <w:sz w:val="24"/>
-          <w:szCs w:val="24"/>
-        </w:rPr>
-        <w:t>Could potentially add reviews for books.</w:t>
+        <w:t>Client Route</w:t>
+      </w:r>
+      <w:r>
+        <w:rPr>
+          <w:rFonts w:ascii="Google Sans Text" w:eastAsia="Google Sans Text" w:hAnsi="Google Sans Text" w:cs="Google Sans Text"/>
+          <w:b/>
+          <w:color w:val="1B1C1D"/>
+          <w:sz w:val="24"/>
+          <w:szCs w:val="24"/>
+        </w:rPr>
+        <w:t xml:space="preserve"> </w:t>
+      </w:r>
+      <w:r>
+        <w:rPr>
+          <w:rFonts w:ascii="Google Sans Text" w:eastAsia="Google Sans Text" w:hAnsi="Google Sans Text" w:cs="Google Sans Text"/>
+          <w:b/>
+          <w:color w:val="1B1C1D"/>
+          <w:sz w:val="24"/>
+          <w:szCs w:val="24"/>
+        </w:rPr>
+        <w:t>(New Feature)</w:t>
+      </w:r>
+      <w:r>
+        <w:rPr>
+          <w:rFonts w:ascii="Google Sans Text" w:eastAsia="Google Sans Text" w:hAnsi="Google Sans Text" w:cs="Google Sans Text"/>
+          <w:b/>
+          <w:color w:val="1B1C1D"/>
+          <w:sz w:val="24"/>
+          <w:szCs w:val="24"/>
+        </w:rPr>
+        <w:t>:</w:t>
       </w:r>
     </w:p>
     <w:p>
@@ -7514,7 +7097,27 @@
           <w:sz w:val="24"/>
           <w:szCs w:val="24"/>
         </w:rPr>
-        <w:t>Could potentially view reviews for books.</w:t>
+        <w:t>/</w:t>
+      </w:r>
+      <w:proofErr w:type="gramStart"/>
+      <w:r>
+        <w:rPr>
+          <w:rFonts w:ascii="Google Sans Text" w:eastAsia="Google Sans Text" w:hAnsi="Google Sans Text" w:cs="Google Sans Text"/>
+          <w:color w:val="1B1C1D"/>
+          <w:sz w:val="24"/>
+          <w:szCs w:val="24"/>
+        </w:rPr>
+        <w:t>reviews</w:t>
+      </w:r>
+      <w:proofErr w:type="gramEnd"/>
+      <w:r>
+        <w:rPr>
+          <w:rFonts w:ascii="Google Sans Text" w:eastAsia="Google Sans Text" w:hAnsi="Google Sans Text" w:cs="Google Sans Text"/>
+          <w:color w:val="1B1C1D"/>
+          <w:sz w:val="24"/>
+          <w:szCs w:val="24"/>
+        </w:rPr>
+        <w:t>: A dedicated page for librarians to view and manage all reviews.</w:t>
       </w:r>
     </w:p>
     <w:p>
@@ -8448,27 +8051,7 @@
           <w:sz w:val="24"/>
           <w:szCs w:val="24"/>
         </w:rPr>
-        <w:t xml:space="preserve">Code shall be </w:t>
-      </w:r>
-      <w:proofErr w:type="gramStart"/>
-      <w:r>
-        <w:rPr>
-          <w:rFonts w:ascii="Google Sans Text" w:eastAsia="Google Sans Text" w:hAnsi="Google Sans Text" w:cs="Google Sans Text"/>
-          <w:color w:val="1B1C1D"/>
-          <w:sz w:val="24"/>
-          <w:szCs w:val="24"/>
-        </w:rPr>
-        <w:t>commented</w:t>
-      </w:r>
-      <w:proofErr w:type="gramEnd"/>
-      <w:r>
-        <w:rPr>
-          <w:rFonts w:ascii="Google Sans Text" w:eastAsia="Google Sans Text" w:hAnsi="Google Sans Text" w:cs="Google Sans Text"/>
-          <w:color w:val="1B1C1D"/>
-          <w:sz w:val="24"/>
-          <w:szCs w:val="24"/>
-        </w:rPr>
-        <w:t xml:space="preserve"> where necessary to explain complex logic.</w:t>
+        <w:t>Code shall be commented where necessary to explain complex logic.</w:t>
       </w:r>
     </w:p>
     <w:p>
@@ -8493,27 +8076,7 @@
           <w:sz w:val="24"/>
           <w:szCs w:val="24"/>
         </w:rPr>
-        <w:t xml:space="preserve">The use of Docker facilitates easier deployment and </w:t>
-      </w:r>
-      <w:proofErr w:type="gramStart"/>
-      <w:r>
-        <w:rPr>
-          <w:rFonts w:ascii="Google Sans Text" w:eastAsia="Google Sans Text" w:hAnsi="Google Sans Text" w:cs="Google Sans Text"/>
-          <w:color w:val="1B1C1D"/>
-          <w:sz w:val="24"/>
-          <w:szCs w:val="24"/>
-        </w:rPr>
-        <w:t>environment</w:t>
-      </w:r>
-      <w:proofErr w:type="gramEnd"/>
-      <w:r>
-        <w:rPr>
-          <w:rFonts w:ascii="Google Sans Text" w:eastAsia="Google Sans Text" w:hAnsi="Google Sans Text" w:cs="Google Sans Text"/>
-          <w:color w:val="1B1C1D"/>
-          <w:sz w:val="24"/>
-          <w:szCs w:val="24"/>
-        </w:rPr>
-        <w:t xml:space="preserve"> management.</w:t>
+        <w:t>The use of Docker facilitates easier deployment and environment management.</w:t>
       </w:r>
     </w:p>
     <w:p>
@@ -13254,7 +12817,6 @@
         <w:t>6.4. Genre Entity (</w:t>
       </w:r>
       <w:proofErr w:type="spellStart"/>
-      <w:proofErr w:type="gramStart"/>
       <w:r>
         <w:rPr>
           <w:rFonts w:ascii="Google Sans" w:eastAsia="Google Sans" w:hAnsi="Google Sans" w:cs="Google Sans"/>
@@ -13265,7 +12827,6 @@
         <w:t>genreSchema</w:t>
       </w:r>
       <w:proofErr w:type="spellEnd"/>
-      <w:proofErr w:type="gramEnd"/>
       <w:r>
         <w:rPr>
           <w:rFonts w:ascii="Google Sans" w:eastAsia="Google Sans" w:hAnsi="Google Sans" w:cs="Google Sans"/>
@@ -14879,27 +14440,7 @@
                 <w:sz w:val="20"/>
                 <w:szCs w:val="20"/>
               </w:rPr>
-              <w:t xml:space="preserve">Foreign key </w:t>
-            </w:r>
-            <w:proofErr w:type="gramStart"/>
-            <w:r>
-              <w:rPr>
-                <w:rFonts w:ascii="Google Sans Text" w:eastAsia="Google Sans Text" w:hAnsi="Google Sans Text" w:cs="Google Sans Text"/>
-                <w:color w:val="1B1C1D"/>
-                <w:sz w:val="20"/>
-                <w:szCs w:val="20"/>
-              </w:rPr>
-              <w:t>referencing</w:t>
-            </w:r>
-            <w:proofErr w:type="gramEnd"/>
-            <w:r>
-              <w:rPr>
-                <w:rFonts w:ascii="Google Sans Text" w:eastAsia="Google Sans Text" w:hAnsi="Google Sans Text" w:cs="Google Sans Text"/>
-                <w:color w:val="1B1C1D"/>
-                <w:sz w:val="20"/>
-                <w:szCs w:val="20"/>
-              </w:rPr>
-              <w:t xml:space="preserve"> the User (member) who borrowed.</w:t>
+              <w:t>Foreign key referencing the User (member) who borrowed.</w:t>
             </w:r>
           </w:p>
         </w:tc>
@@ -15526,6 +15067,24 @@
           <w:szCs w:val="24"/>
         </w:rPr>
         <w:t>)</w:t>
+      </w:r>
+      <w:r>
+        <w:rPr>
+          <w:rFonts w:ascii="Google Sans" w:eastAsia="Google Sans" w:hAnsi="Google Sans" w:cs="Google Sans"/>
+          <w:color w:val="1B1C1D"/>
+          <w:sz w:val="24"/>
+          <w:szCs w:val="24"/>
+        </w:rPr>
+        <w:t xml:space="preserve"> </w:t>
+      </w:r>
+      <w:r>
+        <w:rPr>
+          <w:rFonts w:ascii="Google Sans" w:eastAsia="Google Sans" w:hAnsi="Google Sans" w:cs="Google Sans"/>
+          <w:color w:val="1B1C1D"/>
+          <w:sz w:val="24"/>
+          <w:szCs w:val="24"/>
+        </w:rPr>
+        <w:t>(New Feature)</w:t>
       </w:r>
     </w:p>
     <w:tbl>
@@ -16144,6 +15703,7 @@
                 <w:szCs w:val="20"/>
               </w:rPr>
             </w:pPr>
+            <w:proofErr w:type="spellStart"/>
             <w:r>
               <w:rPr>
                 <w:rFonts w:ascii="Google Sans Text" w:eastAsia="Google Sans Text" w:hAnsi="Google Sans Text" w:cs="Google Sans Text"/>
@@ -16151,7 +15711,100 @@
                 <w:sz w:val="20"/>
                 <w:szCs w:val="20"/>
               </w:rPr>
-              <w:t>star</w:t>
+              <w:t>memberId</w:t>
+            </w:r>
+            <w:proofErr w:type="spellEnd"/>
+          </w:p>
+        </w:tc>
+        <w:tc>
+          <w:tcPr>
+            <w:tcW w:w="2340" w:type="dxa"/>
+            <w:tcBorders>
+              <w:top w:val="single" w:sz="6" w:space="0" w:color="000000"/>
+              <w:left w:val="single" w:sz="6" w:space="0" w:color="000000"/>
+              <w:bottom w:val="single" w:sz="6" w:space="0" w:color="000000"/>
+              <w:right w:val="single" w:sz="6" w:space="0" w:color="000000"/>
+            </w:tcBorders>
+            <w:shd w:val="clear" w:color="auto" w:fill="F8FAFD"/>
+            <w:tcMar>
+              <w:top w:w="120" w:type="dxa"/>
+              <w:left w:w="180" w:type="dxa"/>
+              <w:bottom w:w="120" w:type="dxa"/>
+              <w:right w:w="180" w:type="dxa"/>
+            </w:tcMar>
+          </w:tcPr>
+          <w:p>
+            <w:pPr>
+              <w:pBdr>
+                <w:top w:val="nil"/>
+                <w:left w:val="nil"/>
+                <w:bottom w:val="nil"/>
+                <w:right w:val="nil"/>
+                <w:between w:val="nil"/>
+              </w:pBdr>
+              <w:spacing w:line="275" w:lineRule="auto"/>
+              <w:rPr>
+                <w:rFonts w:ascii="Google Sans Text" w:eastAsia="Google Sans Text" w:hAnsi="Google Sans Text" w:cs="Google Sans Text"/>
+                <w:color w:val="1B1C1D"/>
+                <w:sz w:val="20"/>
+                <w:szCs w:val="20"/>
+              </w:rPr>
+            </w:pPr>
+            <w:proofErr w:type="spellStart"/>
+            <w:r>
+              <w:rPr>
+                <w:rFonts w:ascii="Google Sans Text" w:eastAsia="Google Sans Text" w:hAnsi="Google Sans Text" w:cs="Google Sans Text"/>
+                <w:color w:val="1B1C1D"/>
+                <w:sz w:val="20"/>
+                <w:szCs w:val="20"/>
+              </w:rPr>
+              <w:t>ObjectId</w:t>
+            </w:r>
+            <w:proofErr w:type="spellEnd"/>
+          </w:p>
+        </w:tc>
+        <w:tc>
+          <w:tcPr>
+            <w:tcW w:w="2340" w:type="dxa"/>
+            <w:tcBorders>
+              <w:top w:val="single" w:sz="6" w:space="0" w:color="000000"/>
+              <w:left w:val="single" w:sz="6" w:space="0" w:color="000000"/>
+              <w:bottom w:val="single" w:sz="6" w:space="0" w:color="000000"/>
+              <w:right w:val="single" w:sz="6" w:space="0" w:color="000000"/>
+            </w:tcBorders>
+            <w:shd w:val="clear" w:color="auto" w:fill="F8FAFD"/>
+            <w:tcMar>
+              <w:top w:w="120" w:type="dxa"/>
+              <w:left w:w="180" w:type="dxa"/>
+              <w:bottom w:w="120" w:type="dxa"/>
+              <w:right w:w="180" w:type="dxa"/>
+            </w:tcMar>
+          </w:tcPr>
+          <w:p>
+            <w:pPr>
+              <w:pBdr>
+                <w:top w:val="nil"/>
+                <w:left w:val="nil"/>
+                <w:bottom w:val="nil"/>
+                <w:right w:val="nil"/>
+                <w:between w:val="nil"/>
+              </w:pBdr>
+              <w:spacing w:line="275" w:lineRule="auto"/>
+              <w:rPr>
+                <w:rFonts w:ascii="Google Sans Text" w:eastAsia="Google Sans Text" w:hAnsi="Google Sans Text" w:cs="Google Sans Text"/>
+                <w:color w:val="1B1C1D"/>
+                <w:sz w:val="20"/>
+                <w:szCs w:val="20"/>
+              </w:rPr>
+            </w:pPr>
+            <w:r>
+              <w:rPr>
+                <w:rFonts w:ascii="Google Sans Text" w:eastAsia="Google Sans Text" w:hAnsi="Google Sans Text" w:cs="Google Sans Text"/>
+                <w:color w:val="1B1C1D"/>
+                <w:sz w:val="20"/>
+                <w:szCs w:val="20"/>
+              </w:rPr>
+              <w:t>Required, Refers to 'User'</w:t>
             </w:r>
           </w:p>
         </w:tc>
@@ -16196,117 +15849,7 @@
                 <w:sz w:val="20"/>
                 <w:szCs w:val="20"/>
               </w:rPr>
-              <w:t>String</w:t>
-            </w:r>
-          </w:p>
-        </w:tc>
-        <w:tc>
-          <w:tcPr>
-            <w:tcW w:w="2340" w:type="dxa"/>
-            <w:tcBorders>
-              <w:top w:val="single" w:sz="6" w:space="0" w:color="000000"/>
-              <w:left w:val="single" w:sz="6" w:space="0" w:color="000000"/>
-              <w:bottom w:val="single" w:sz="6" w:space="0" w:color="000000"/>
-              <w:right w:val="single" w:sz="6" w:space="0" w:color="000000"/>
-            </w:tcBorders>
-            <w:shd w:val="clear" w:color="auto" w:fill="F8FAFD"/>
-            <w:tcMar>
-              <w:top w:w="120" w:type="dxa"/>
-              <w:left w:w="180" w:type="dxa"/>
-              <w:bottom w:w="120" w:type="dxa"/>
-              <w:right w:w="180" w:type="dxa"/>
-            </w:tcMar>
-          </w:tcPr>
-          <w:p>
-            <w:pPr>
-              <w:pBdr>
-                <w:top w:val="nil"/>
-                <w:left w:val="nil"/>
-                <w:bottom w:val="nil"/>
-                <w:right w:val="nil"/>
-                <w:between w:val="nil"/>
-              </w:pBdr>
-              <w:spacing w:line="275" w:lineRule="auto"/>
-              <w:rPr>
-                <w:rFonts w:ascii="Google Sans Text" w:eastAsia="Google Sans Text" w:hAnsi="Google Sans Text" w:cs="Google Sans Text"/>
-                <w:color w:val="1B1C1D"/>
-                <w:sz w:val="20"/>
-                <w:szCs w:val="20"/>
-              </w:rPr>
-            </w:pPr>
-            <w:r>
-              <w:rPr>
-                <w:rFonts w:ascii="Google Sans Text" w:eastAsia="Google Sans Text" w:hAnsi="Google Sans Text" w:cs="Google Sans Text"/>
-                <w:color w:val="1B1C1D"/>
-                <w:sz w:val="20"/>
-                <w:szCs w:val="20"/>
-              </w:rPr>
-              <w:t>Required</w:t>
-            </w:r>
-          </w:p>
-        </w:tc>
-        <w:tc>
-          <w:tcPr>
-            <w:tcW w:w="2340" w:type="dxa"/>
-            <w:tcBorders>
-              <w:top w:val="single" w:sz="6" w:space="0" w:color="000000"/>
-              <w:left w:val="single" w:sz="6" w:space="0" w:color="000000"/>
-              <w:bottom w:val="single" w:sz="6" w:space="0" w:color="000000"/>
-              <w:right w:val="single" w:sz="6" w:space="0" w:color="000000"/>
-            </w:tcBorders>
-            <w:shd w:val="clear" w:color="auto" w:fill="F8FAFD"/>
-            <w:tcMar>
-              <w:top w:w="120" w:type="dxa"/>
-              <w:left w:w="180" w:type="dxa"/>
-              <w:bottom w:w="120" w:type="dxa"/>
-              <w:right w:w="180" w:type="dxa"/>
-            </w:tcMar>
-          </w:tcPr>
-          <w:p>
-            <w:pPr>
-              <w:pBdr>
-                <w:top w:val="nil"/>
-                <w:left w:val="nil"/>
-                <w:bottom w:val="nil"/>
-                <w:right w:val="nil"/>
-                <w:between w:val="nil"/>
-              </w:pBdr>
-              <w:spacing w:line="275" w:lineRule="auto"/>
-              <w:rPr>
-                <w:rFonts w:ascii="Google Sans Text" w:eastAsia="Google Sans Text" w:hAnsi="Google Sans Text" w:cs="Google Sans Text"/>
-                <w:color w:val="1B1C1D"/>
-                <w:sz w:val="20"/>
-                <w:szCs w:val="20"/>
-              </w:rPr>
-            </w:pPr>
-            <w:r>
-              <w:rPr>
-                <w:rFonts w:ascii="Google Sans Text" w:eastAsia="Google Sans Text" w:hAnsi="Google Sans Text" w:cs="Google Sans Text"/>
-                <w:color w:val="1B1C1D"/>
-                <w:sz w:val="20"/>
-                <w:szCs w:val="20"/>
-              </w:rPr>
-              <w:t xml:space="preserve">Star rating given for the book (e.g., "1" to "5"). Consider </w:t>
-            </w:r>
-            <w:proofErr w:type="gramStart"/>
-            <w:r>
-              <w:rPr>
-                <w:rFonts w:ascii="Google Sans Text" w:eastAsia="Google Sans Text" w:hAnsi="Google Sans Text" w:cs="Google Sans Text"/>
-                <w:color w:val="1B1C1D"/>
-                <w:sz w:val="20"/>
-                <w:szCs w:val="20"/>
-              </w:rPr>
-              <w:t>changing</w:t>
-            </w:r>
-            <w:proofErr w:type="gramEnd"/>
-            <w:r>
-              <w:rPr>
-                <w:rFonts w:ascii="Google Sans Text" w:eastAsia="Google Sans Text" w:hAnsi="Google Sans Text" w:cs="Google Sans Text"/>
-                <w:color w:val="1B1C1D"/>
-                <w:sz w:val="20"/>
-                <w:szCs w:val="20"/>
-              </w:rPr>
-              <w:t xml:space="preserve"> to Number.</w:t>
+              <w:t>Foreign key referencing the user (member) who wrote the review.</w:t>
             </w:r>
           </w:p>
         </w:tc>
@@ -16354,6 +15897,188 @@
                 <w:szCs w:val="20"/>
               </w:rPr>
               <w:t>rating</w:t>
+            </w:r>
+          </w:p>
+        </w:tc>
+        <w:tc>
+          <w:tcPr>
+            <w:tcW w:w="2340" w:type="dxa"/>
+            <w:tcBorders>
+              <w:top w:val="single" w:sz="6" w:space="0" w:color="000000"/>
+              <w:left w:val="single" w:sz="6" w:space="0" w:color="000000"/>
+              <w:bottom w:val="single" w:sz="6" w:space="0" w:color="000000"/>
+              <w:right w:val="single" w:sz="6" w:space="0" w:color="000000"/>
+            </w:tcBorders>
+            <w:shd w:val="clear" w:color="auto" w:fill="F8FAFD"/>
+            <w:tcMar>
+              <w:top w:w="120" w:type="dxa"/>
+              <w:left w:w="180" w:type="dxa"/>
+              <w:bottom w:w="120" w:type="dxa"/>
+              <w:right w:w="180" w:type="dxa"/>
+            </w:tcMar>
+          </w:tcPr>
+          <w:p>
+            <w:pPr>
+              <w:pBdr>
+                <w:top w:val="nil"/>
+                <w:left w:val="nil"/>
+                <w:bottom w:val="nil"/>
+                <w:right w:val="nil"/>
+                <w:between w:val="nil"/>
+              </w:pBdr>
+              <w:spacing w:line="275" w:lineRule="auto"/>
+              <w:rPr>
+                <w:rFonts w:ascii="Google Sans Text" w:eastAsia="Google Sans Text" w:hAnsi="Google Sans Text" w:cs="Google Sans Text"/>
+                <w:color w:val="1B1C1D"/>
+                <w:sz w:val="20"/>
+                <w:szCs w:val="20"/>
+              </w:rPr>
+            </w:pPr>
+            <w:r>
+              <w:rPr>
+                <w:rFonts w:ascii="Google Sans Text" w:eastAsia="Google Sans Text" w:hAnsi="Google Sans Text" w:cs="Google Sans Text"/>
+                <w:color w:val="1B1C1D"/>
+                <w:sz w:val="20"/>
+                <w:szCs w:val="20"/>
+              </w:rPr>
+              <w:t>Number</w:t>
+            </w:r>
+          </w:p>
+        </w:tc>
+        <w:tc>
+          <w:tcPr>
+            <w:tcW w:w="2340" w:type="dxa"/>
+            <w:tcBorders>
+              <w:top w:val="single" w:sz="6" w:space="0" w:color="000000"/>
+              <w:left w:val="single" w:sz="6" w:space="0" w:color="000000"/>
+              <w:bottom w:val="single" w:sz="6" w:space="0" w:color="000000"/>
+              <w:right w:val="single" w:sz="6" w:space="0" w:color="000000"/>
+            </w:tcBorders>
+            <w:shd w:val="clear" w:color="auto" w:fill="F8FAFD"/>
+            <w:tcMar>
+              <w:top w:w="120" w:type="dxa"/>
+              <w:left w:w="180" w:type="dxa"/>
+              <w:bottom w:w="120" w:type="dxa"/>
+              <w:right w:w="180" w:type="dxa"/>
+            </w:tcMar>
+          </w:tcPr>
+          <w:p>
+            <w:pPr>
+              <w:pBdr>
+                <w:top w:val="nil"/>
+                <w:left w:val="nil"/>
+                <w:bottom w:val="nil"/>
+                <w:right w:val="nil"/>
+                <w:between w:val="nil"/>
+              </w:pBdr>
+              <w:spacing w:line="275" w:lineRule="auto"/>
+              <w:rPr>
+                <w:rFonts w:ascii="Google Sans Text" w:eastAsia="Google Sans Text" w:hAnsi="Google Sans Text" w:cs="Google Sans Text"/>
+                <w:color w:val="1B1C1D"/>
+                <w:sz w:val="20"/>
+                <w:szCs w:val="20"/>
+              </w:rPr>
+            </w:pPr>
+            <w:r>
+              <w:rPr>
+                <w:rFonts w:ascii="Google Sans Text" w:eastAsia="Google Sans Text" w:hAnsi="Google Sans Text" w:cs="Google Sans Text"/>
+                <w:color w:val="1B1C1D"/>
+                <w:sz w:val="20"/>
+                <w:szCs w:val="20"/>
+              </w:rPr>
+              <w:t>Required, Min: 1, Max: 5</w:t>
+            </w:r>
+          </w:p>
+        </w:tc>
+        <w:tc>
+          <w:tcPr>
+            <w:tcW w:w="2340" w:type="dxa"/>
+            <w:tcBorders>
+              <w:top w:val="single" w:sz="6" w:space="0" w:color="000000"/>
+              <w:left w:val="single" w:sz="6" w:space="0" w:color="000000"/>
+              <w:bottom w:val="single" w:sz="6" w:space="0" w:color="000000"/>
+              <w:right w:val="single" w:sz="6" w:space="0" w:color="000000"/>
+            </w:tcBorders>
+            <w:shd w:val="clear" w:color="auto" w:fill="F8FAFD"/>
+            <w:tcMar>
+              <w:top w:w="120" w:type="dxa"/>
+              <w:left w:w="180" w:type="dxa"/>
+              <w:bottom w:w="120" w:type="dxa"/>
+              <w:right w:w="180" w:type="dxa"/>
+            </w:tcMar>
+          </w:tcPr>
+          <w:p>
+            <w:pPr>
+              <w:pBdr>
+                <w:top w:val="nil"/>
+                <w:left w:val="nil"/>
+                <w:bottom w:val="nil"/>
+                <w:right w:val="nil"/>
+                <w:between w:val="nil"/>
+              </w:pBdr>
+              <w:spacing w:line="275" w:lineRule="auto"/>
+              <w:rPr>
+                <w:rFonts w:ascii="Google Sans Text" w:eastAsia="Google Sans Text" w:hAnsi="Google Sans Text" w:cs="Google Sans Text"/>
+                <w:color w:val="1B1C1D"/>
+                <w:sz w:val="20"/>
+                <w:szCs w:val="20"/>
+              </w:rPr>
+            </w:pPr>
+            <w:r>
+              <w:rPr>
+                <w:rFonts w:ascii="Google Sans Text" w:eastAsia="Google Sans Text" w:hAnsi="Google Sans Text" w:cs="Google Sans Text"/>
+                <w:color w:val="1B1C1D"/>
+                <w:sz w:val="20"/>
+                <w:szCs w:val="20"/>
+              </w:rPr>
+              <w:t>The star rating given to the book.</w:t>
+            </w:r>
+          </w:p>
+        </w:tc>
+      </w:tr>
+      <w:tr>
+        <w:tc>
+          <w:tcPr>
+            <w:tcW w:w="2340" w:type="dxa"/>
+            <w:tcBorders>
+              <w:top w:val="single" w:sz="6" w:space="0" w:color="000000"/>
+              <w:left w:val="single" w:sz="6" w:space="0" w:color="000000"/>
+              <w:bottom w:val="single" w:sz="6" w:space="0" w:color="000000"/>
+              <w:right w:val="single" w:sz="6" w:space="0" w:color="000000"/>
+            </w:tcBorders>
+            <w:shd w:val="clear" w:color="auto" w:fill="F8FAFD"/>
+            <w:tcMar>
+              <w:top w:w="120" w:type="dxa"/>
+              <w:left w:w="180" w:type="dxa"/>
+              <w:bottom w:w="120" w:type="dxa"/>
+              <w:right w:w="180" w:type="dxa"/>
+            </w:tcMar>
+          </w:tcPr>
+          <w:p>
+            <w:pPr>
+              <w:pBdr>
+                <w:top w:val="nil"/>
+                <w:left w:val="nil"/>
+                <w:bottom w:val="nil"/>
+                <w:right w:val="nil"/>
+                <w:between w:val="nil"/>
+              </w:pBdr>
+              <w:spacing w:line="275" w:lineRule="auto"/>
+              <w:rPr>
+                <w:rFonts w:ascii="Google Sans Text" w:eastAsia="Google Sans Text" w:hAnsi="Google Sans Text" w:cs="Google Sans Text"/>
+                <w:color w:val="1B1C1D"/>
+                <w:sz w:val="20"/>
+                <w:szCs w:val="20"/>
+              </w:rPr>
+            </w:pPr>
+            <w:r>
+              <w:rPr>
+                <w:rFonts w:ascii="Google Sans Text" w:eastAsia="Google Sans Text" w:hAnsi="Google Sans Text" w:cs="Google Sans Text"/>
+                <w:color w:val="1B1C1D"/>
+                <w:sz w:val="20"/>
+                <w:szCs w:val="20"/>
+              </w:rPr>
+              <w:t>comment</w:t>
             </w:r>
           </w:p>
         </w:tc>
@@ -16488,12 +16213,382 @@
                 <w:sz w:val="20"/>
                 <w:szCs w:val="20"/>
               </w:rPr>
-              <w:t>Textual content of the review.</w:t>
+              <w:t>The textual content of the review.</w:t>
+            </w:r>
+          </w:p>
+        </w:tc>
+      </w:tr>
+      <w:tr>
+        <w:tc>
+          <w:tcPr>
+            <w:tcW w:w="2340" w:type="dxa"/>
+            <w:tcBorders>
+              <w:top w:val="single" w:sz="6" w:space="0" w:color="000000"/>
+              <w:left w:val="single" w:sz="6" w:space="0" w:color="000000"/>
+              <w:bottom w:val="single" w:sz="6" w:space="0" w:color="000000"/>
+              <w:right w:val="single" w:sz="6" w:space="0" w:color="000000"/>
+            </w:tcBorders>
+            <w:shd w:val="clear" w:color="auto" w:fill="F8FAFD"/>
+            <w:tcMar>
+              <w:top w:w="120" w:type="dxa"/>
+              <w:left w:w="180" w:type="dxa"/>
+              <w:bottom w:w="120" w:type="dxa"/>
+              <w:right w:w="180" w:type="dxa"/>
+            </w:tcMar>
+          </w:tcPr>
+          <w:p>
+            <w:pPr>
+              <w:pBdr>
+                <w:top w:val="nil"/>
+                <w:left w:val="nil"/>
+                <w:bottom w:val="nil"/>
+                <w:right w:val="nil"/>
+                <w:between w:val="nil"/>
+              </w:pBdr>
+              <w:spacing w:line="275" w:lineRule="auto"/>
+              <w:rPr>
+                <w:rFonts w:ascii="Google Sans Text" w:eastAsia="Google Sans Text" w:hAnsi="Google Sans Text" w:cs="Google Sans Text"/>
+                <w:color w:val="1B1C1D"/>
+                <w:sz w:val="20"/>
+                <w:szCs w:val="20"/>
+              </w:rPr>
+            </w:pPr>
+            <w:proofErr w:type="spellStart"/>
+            <w:r>
+              <w:rPr>
+                <w:rFonts w:ascii="Google Sans Text" w:eastAsia="Google Sans Text" w:hAnsi="Google Sans Text" w:cs="Google Sans Text"/>
+                <w:color w:val="1B1C1D"/>
+                <w:sz w:val="20"/>
+                <w:szCs w:val="20"/>
+              </w:rPr>
+              <w:t>createdAt</w:t>
+            </w:r>
+            <w:proofErr w:type="spellEnd"/>
+          </w:p>
+        </w:tc>
+        <w:tc>
+          <w:tcPr>
+            <w:tcW w:w="2340" w:type="dxa"/>
+            <w:tcBorders>
+              <w:top w:val="single" w:sz="6" w:space="0" w:color="000000"/>
+              <w:left w:val="single" w:sz="6" w:space="0" w:color="000000"/>
+              <w:bottom w:val="single" w:sz="6" w:space="0" w:color="000000"/>
+              <w:right w:val="single" w:sz="6" w:space="0" w:color="000000"/>
+            </w:tcBorders>
+            <w:shd w:val="clear" w:color="auto" w:fill="F8FAFD"/>
+            <w:tcMar>
+              <w:top w:w="120" w:type="dxa"/>
+              <w:left w:w="180" w:type="dxa"/>
+              <w:bottom w:w="120" w:type="dxa"/>
+              <w:right w:w="180" w:type="dxa"/>
+            </w:tcMar>
+          </w:tcPr>
+          <w:p>
+            <w:pPr>
+              <w:pBdr>
+                <w:top w:val="nil"/>
+                <w:left w:val="nil"/>
+                <w:bottom w:val="nil"/>
+                <w:right w:val="nil"/>
+                <w:between w:val="nil"/>
+              </w:pBdr>
+              <w:spacing w:line="275" w:lineRule="auto"/>
+              <w:rPr>
+                <w:rFonts w:ascii="Google Sans Text" w:eastAsia="Google Sans Text" w:hAnsi="Google Sans Text" w:cs="Google Sans Text"/>
+                <w:color w:val="1B1C1D"/>
+                <w:sz w:val="20"/>
+                <w:szCs w:val="20"/>
+              </w:rPr>
+            </w:pPr>
+            <w:r>
+              <w:rPr>
+                <w:rFonts w:ascii="Google Sans Text" w:eastAsia="Google Sans Text" w:hAnsi="Google Sans Text" w:cs="Google Sans Text"/>
+                <w:color w:val="1B1C1D"/>
+                <w:sz w:val="20"/>
+                <w:szCs w:val="20"/>
+              </w:rPr>
+              <w:t>Date</w:t>
+            </w:r>
+          </w:p>
+        </w:tc>
+        <w:tc>
+          <w:tcPr>
+            <w:tcW w:w="2340" w:type="dxa"/>
+            <w:tcBorders>
+              <w:top w:val="single" w:sz="6" w:space="0" w:color="000000"/>
+              <w:left w:val="single" w:sz="6" w:space="0" w:color="000000"/>
+              <w:bottom w:val="single" w:sz="6" w:space="0" w:color="000000"/>
+              <w:right w:val="single" w:sz="6" w:space="0" w:color="000000"/>
+            </w:tcBorders>
+            <w:shd w:val="clear" w:color="auto" w:fill="F8FAFD"/>
+            <w:tcMar>
+              <w:top w:w="120" w:type="dxa"/>
+              <w:left w:w="180" w:type="dxa"/>
+              <w:bottom w:w="120" w:type="dxa"/>
+              <w:right w:w="180" w:type="dxa"/>
+            </w:tcMar>
+          </w:tcPr>
+          <w:p>
+            <w:pPr>
+              <w:pBdr>
+                <w:top w:val="nil"/>
+                <w:left w:val="nil"/>
+                <w:bottom w:val="nil"/>
+                <w:right w:val="nil"/>
+                <w:between w:val="nil"/>
+              </w:pBdr>
+              <w:spacing w:line="275" w:lineRule="auto"/>
+              <w:rPr>
+                <w:rFonts w:ascii="Google Sans Text" w:eastAsia="Google Sans Text" w:hAnsi="Google Sans Text" w:cs="Google Sans Text"/>
+                <w:color w:val="1B1C1D"/>
+                <w:sz w:val="20"/>
+                <w:szCs w:val="20"/>
+              </w:rPr>
+            </w:pPr>
+            <w:r>
+              <w:rPr>
+                <w:rFonts w:ascii="Google Sans Text" w:eastAsia="Google Sans Text" w:hAnsi="Google Sans Text" w:cs="Google Sans Text"/>
+                <w:color w:val="1B1C1D"/>
+                <w:sz w:val="20"/>
+                <w:szCs w:val="20"/>
+              </w:rPr>
+              <w:t>Auto-generated</w:t>
+            </w:r>
+          </w:p>
+        </w:tc>
+        <w:tc>
+          <w:tcPr>
+            <w:tcW w:w="2340" w:type="dxa"/>
+            <w:tcBorders>
+              <w:top w:val="single" w:sz="6" w:space="0" w:color="000000"/>
+              <w:left w:val="single" w:sz="6" w:space="0" w:color="000000"/>
+              <w:bottom w:val="single" w:sz="6" w:space="0" w:color="000000"/>
+              <w:right w:val="single" w:sz="6" w:space="0" w:color="000000"/>
+            </w:tcBorders>
+            <w:shd w:val="clear" w:color="auto" w:fill="F8FAFD"/>
+            <w:tcMar>
+              <w:top w:w="120" w:type="dxa"/>
+              <w:left w:w="180" w:type="dxa"/>
+              <w:bottom w:w="120" w:type="dxa"/>
+              <w:right w:w="180" w:type="dxa"/>
+            </w:tcMar>
+          </w:tcPr>
+          <w:p>
+            <w:pPr>
+              <w:pBdr>
+                <w:top w:val="nil"/>
+                <w:left w:val="nil"/>
+                <w:bottom w:val="nil"/>
+                <w:right w:val="nil"/>
+                <w:between w:val="nil"/>
+              </w:pBdr>
+              <w:spacing w:line="275" w:lineRule="auto"/>
+              <w:rPr>
+                <w:rFonts w:ascii="Google Sans Text" w:eastAsia="Google Sans Text" w:hAnsi="Google Sans Text" w:cs="Google Sans Text"/>
+                <w:color w:val="1B1C1D"/>
+                <w:sz w:val="20"/>
+                <w:szCs w:val="20"/>
+              </w:rPr>
+            </w:pPr>
+            <w:r>
+              <w:rPr>
+                <w:rFonts w:ascii="Google Sans Text" w:eastAsia="Google Sans Text" w:hAnsi="Google Sans Text" w:cs="Google Sans Text"/>
+                <w:color w:val="1B1C1D"/>
+                <w:sz w:val="20"/>
+                <w:szCs w:val="20"/>
+              </w:rPr>
+              <w:t>Timestamp for when the review was created.</w:t>
+            </w:r>
+          </w:p>
+        </w:tc>
+      </w:tr>
+      <w:tr>
+        <w:tc>
+          <w:tcPr>
+            <w:tcW w:w="2340" w:type="dxa"/>
+            <w:tcBorders>
+              <w:top w:val="single" w:sz="6" w:space="0" w:color="000000"/>
+              <w:left w:val="single" w:sz="6" w:space="0" w:color="000000"/>
+              <w:bottom w:val="single" w:sz="6" w:space="0" w:color="000000"/>
+              <w:right w:val="single" w:sz="6" w:space="0" w:color="000000"/>
+            </w:tcBorders>
+            <w:shd w:val="clear" w:color="auto" w:fill="F8FAFD"/>
+            <w:tcMar>
+              <w:top w:w="120" w:type="dxa"/>
+              <w:left w:w="180" w:type="dxa"/>
+              <w:bottom w:w="120" w:type="dxa"/>
+              <w:right w:w="180" w:type="dxa"/>
+            </w:tcMar>
+          </w:tcPr>
+          <w:p>
+            <w:pPr>
+              <w:pBdr>
+                <w:top w:val="nil"/>
+                <w:left w:val="nil"/>
+                <w:bottom w:val="nil"/>
+                <w:right w:val="nil"/>
+                <w:between w:val="nil"/>
+              </w:pBdr>
+              <w:spacing w:line="275" w:lineRule="auto"/>
+              <w:rPr>
+                <w:rFonts w:ascii="Google Sans Text" w:eastAsia="Google Sans Text" w:hAnsi="Google Sans Text" w:cs="Google Sans Text"/>
+                <w:color w:val="1B1C1D"/>
+                <w:sz w:val="20"/>
+                <w:szCs w:val="20"/>
+              </w:rPr>
+            </w:pPr>
+            <w:proofErr w:type="spellStart"/>
+            <w:r>
+              <w:rPr>
+                <w:rFonts w:ascii="Google Sans Text" w:eastAsia="Google Sans Text" w:hAnsi="Google Sans Text" w:cs="Google Sans Text"/>
+                <w:color w:val="1B1C1D"/>
+                <w:sz w:val="20"/>
+                <w:szCs w:val="20"/>
+              </w:rPr>
+              <w:t>updatedAt</w:t>
+            </w:r>
+            <w:proofErr w:type="spellEnd"/>
+          </w:p>
+        </w:tc>
+        <w:tc>
+          <w:tcPr>
+            <w:tcW w:w="2340" w:type="dxa"/>
+            <w:tcBorders>
+              <w:top w:val="single" w:sz="6" w:space="0" w:color="000000"/>
+              <w:left w:val="single" w:sz="6" w:space="0" w:color="000000"/>
+              <w:bottom w:val="single" w:sz="6" w:space="0" w:color="000000"/>
+              <w:right w:val="single" w:sz="6" w:space="0" w:color="000000"/>
+            </w:tcBorders>
+            <w:shd w:val="clear" w:color="auto" w:fill="F8FAFD"/>
+            <w:tcMar>
+              <w:top w:w="120" w:type="dxa"/>
+              <w:left w:w="180" w:type="dxa"/>
+              <w:bottom w:w="120" w:type="dxa"/>
+              <w:right w:w="180" w:type="dxa"/>
+            </w:tcMar>
+          </w:tcPr>
+          <w:p>
+            <w:pPr>
+              <w:pBdr>
+                <w:top w:val="nil"/>
+                <w:left w:val="nil"/>
+                <w:bottom w:val="nil"/>
+                <w:right w:val="nil"/>
+                <w:between w:val="nil"/>
+              </w:pBdr>
+              <w:spacing w:line="275" w:lineRule="auto"/>
+              <w:rPr>
+                <w:rFonts w:ascii="Google Sans Text" w:eastAsia="Google Sans Text" w:hAnsi="Google Sans Text" w:cs="Google Sans Text"/>
+                <w:color w:val="1B1C1D"/>
+                <w:sz w:val="20"/>
+                <w:szCs w:val="20"/>
+              </w:rPr>
+            </w:pPr>
+            <w:r>
+              <w:rPr>
+                <w:rFonts w:ascii="Google Sans Text" w:eastAsia="Google Sans Text" w:hAnsi="Google Sans Text" w:cs="Google Sans Text"/>
+                <w:color w:val="1B1C1D"/>
+                <w:sz w:val="20"/>
+                <w:szCs w:val="20"/>
+              </w:rPr>
+              <w:t>Date</w:t>
+            </w:r>
+          </w:p>
+        </w:tc>
+        <w:tc>
+          <w:tcPr>
+            <w:tcW w:w="2340" w:type="dxa"/>
+            <w:tcBorders>
+              <w:top w:val="single" w:sz="6" w:space="0" w:color="000000"/>
+              <w:left w:val="single" w:sz="6" w:space="0" w:color="000000"/>
+              <w:bottom w:val="single" w:sz="6" w:space="0" w:color="000000"/>
+              <w:right w:val="single" w:sz="6" w:space="0" w:color="000000"/>
+            </w:tcBorders>
+            <w:shd w:val="clear" w:color="auto" w:fill="F8FAFD"/>
+            <w:tcMar>
+              <w:top w:w="120" w:type="dxa"/>
+              <w:left w:w="180" w:type="dxa"/>
+              <w:bottom w:w="120" w:type="dxa"/>
+              <w:right w:w="180" w:type="dxa"/>
+            </w:tcMar>
+          </w:tcPr>
+          <w:p>
+            <w:pPr>
+              <w:pBdr>
+                <w:top w:val="nil"/>
+                <w:left w:val="nil"/>
+                <w:bottom w:val="nil"/>
+                <w:right w:val="nil"/>
+                <w:between w:val="nil"/>
+              </w:pBdr>
+              <w:spacing w:line="275" w:lineRule="auto"/>
+              <w:rPr>
+                <w:rFonts w:ascii="Google Sans Text" w:eastAsia="Google Sans Text" w:hAnsi="Google Sans Text" w:cs="Google Sans Text"/>
+                <w:color w:val="1B1C1D"/>
+                <w:sz w:val="20"/>
+                <w:szCs w:val="20"/>
+              </w:rPr>
+            </w:pPr>
+            <w:r>
+              <w:rPr>
+                <w:rFonts w:ascii="Google Sans Text" w:eastAsia="Google Sans Text" w:hAnsi="Google Sans Text" w:cs="Google Sans Text"/>
+                <w:color w:val="1B1C1D"/>
+                <w:sz w:val="20"/>
+                <w:szCs w:val="20"/>
+              </w:rPr>
+              <w:t>Auto-generated</w:t>
+            </w:r>
+          </w:p>
+        </w:tc>
+        <w:tc>
+          <w:tcPr>
+            <w:tcW w:w="2340" w:type="dxa"/>
+            <w:tcBorders>
+              <w:top w:val="single" w:sz="6" w:space="0" w:color="000000"/>
+              <w:left w:val="single" w:sz="6" w:space="0" w:color="000000"/>
+              <w:bottom w:val="single" w:sz="6" w:space="0" w:color="000000"/>
+              <w:right w:val="single" w:sz="6" w:space="0" w:color="000000"/>
+            </w:tcBorders>
+            <w:shd w:val="clear" w:color="auto" w:fill="F8FAFD"/>
+            <w:tcMar>
+              <w:top w:w="120" w:type="dxa"/>
+              <w:left w:w="180" w:type="dxa"/>
+              <w:bottom w:w="120" w:type="dxa"/>
+              <w:right w:w="180" w:type="dxa"/>
+            </w:tcMar>
+          </w:tcPr>
+          <w:p>
+            <w:pPr>
+              <w:pBdr>
+                <w:top w:val="nil"/>
+                <w:left w:val="nil"/>
+                <w:bottom w:val="nil"/>
+                <w:right w:val="nil"/>
+                <w:between w:val="nil"/>
+              </w:pBdr>
+              <w:spacing w:line="275" w:lineRule="auto"/>
+              <w:rPr>
+                <w:rFonts w:ascii="Google Sans Text" w:eastAsia="Google Sans Text" w:hAnsi="Google Sans Text" w:cs="Google Sans Text"/>
+                <w:color w:val="1B1C1D"/>
+                <w:sz w:val="20"/>
+                <w:szCs w:val="20"/>
+              </w:rPr>
+            </w:pPr>
+            <w:r>
+              <w:rPr>
+                <w:rFonts w:ascii="Google Sans Text" w:eastAsia="Google Sans Text" w:hAnsi="Google Sans Text" w:cs="Google Sans Text"/>
+                <w:color w:val="1B1C1D"/>
+                <w:sz w:val="20"/>
+                <w:szCs w:val="20"/>
+              </w:rPr>
+              <w:t>Timestamp for when the review was last updated.</w:t>
             </w:r>
           </w:p>
         </w:tc>
       </w:tr>
     </w:tbl>
+    <w:p/>
+    <w:p/>
     <w:p>
       <w:pPr>
         <w:pStyle w:val="Heading3"/>
@@ -16642,6 +16737,7 @@
           <w:sz w:val="24"/>
           <w:szCs w:val="24"/>
         </w:rPr>
+        <w:lastRenderedPageBreak/>
         <w:t xml:space="preserve">A </w:t>
       </w:r>
       <w:r>
@@ -17020,30 +17116,118 @@
         </w:rPr>
         <w:t>.</w:t>
       </w:r>
+      <w:r>
+        <w:rPr>
+          <w:rFonts w:ascii="Google Sans Text" w:eastAsia="Google Sans Text" w:hAnsi="Google Sans Text" w:cs="Google Sans Text"/>
+          <w:color w:val="1B1C1D"/>
+          <w:sz w:val="24"/>
+          <w:szCs w:val="24"/>
+        </w:rPr>
+        <w:t xml:space="preserve"> </w:t>
+      </w:r>
+      <w:r>
+        <w:rPr>
+          <w:rFonts w:ascii="Google Sans Text" w:eastAsia="Google Sans Text" w:hAnsi="Google Sans Text" w:cs="Google Sans Text"/>
+          <w:b/>
+          <w:bCs/>
+          <w:color w:val="1B1C1D"/>
+          <w:sz w:val="24"/>
+          <w:szCs w:val="24"/>
+        </w:rPr>
+        <w:t>(New Feature)</w:t>
+      </w:r>
     </w:p>
     <w:p>
       <w:pPr>
-        <w:pStyle w:val="Heading2"/>
-        <w:spacing w:before="120" w:after="120" w:line="275" w:lineRule="auto"/>
-        <w:rPr>
-          <w:rFonts w:ascii="Google Sans" w:eastAsia="Google Sans" w:hAnsi="Google Sans" w:cs="Google Sans"/>
-          <w:color w:val="1B1C1D"/>
-          <w:sz w:val="30"/>
-          <w:szCs w:val="30"/>
-        </w:rPr>
-      </w:pPr>
-      <w:r>
-        <w:rPr>
-          <w:rFonts w:ascii="Google Sans" w:eastAsia="Google Sans" w:hAnsi="Google Sans" w:cs="Google Sans"/>
-          <w:color w:val="1B1C1D"/>
-          <w:sz w:val="30"/>
-          <w:szCs w:val="30"/>
-        </w:rPr>
-        <w:t>7. Key Use Cases</w:t>
+        <w:numPr>
+          <w:ilvl w:val="0"/>
+          <w:numId w:val="25"/>
+        </w:numPr>
+        <w:pBdr>
+          <w:top w:val="nil"/>
+          <w:left w:val="nil"/>
+          <w:bottom w:val="nil"/>
+          <w:right w:val="nil"/>
+          <w:between w:val="nil"/>
+        </w:pBdr>
+        <w:spacing w:after="120" w:line="275" w:lineRule="auto"/>
+      </w:pPr>
+      <w:r>
+        <w:t xml:space="preserve">A </w:t>
+      </w:r>
+      <w:r>
+        <w:rPr>
+          <w:b/>
+          <w:bCs/>
+        </w:rPr>
+        <w:t>Review</w:t>
+      </w:r>
+      <w:r>
+        <w:t xml:space="preserve"> record is linked to the one </w:t>
+      </w:r>
+      <w:r>
+        <w:rPr>
+          <w:b/>
+          <w:bCs/>
+        </w:rPr>
+        <w:t>User</w:t>
+      </w:r>
+      <w:r>
+        <w:t xml:space="preserve"> (Member) who wrote it. </w:t>
+      </w:r>
+      <w:r>
+        <w:rPr>
+          <w:b/>
+          <w:bCs/>
+        </w:rPr>
+        <w:t>(New Feature)</w:t>
       </w:r>
     </w:p>
     <w:p>
       <w:pPr>
+        <w:numPr>
+          <w:ilvl w:val="0"/>
+          <w:numId w:val="25"/>
+        </w:numPr>
+        <w:pBdr>
+          <w:top w:val="nil"/>
+          <w:left w:val="nil"/>
+          <w:bottom w:val="nil"/>
+          <w:right w:val="nil"/>
+          <w:between w:val="nil"/>
+        </w:pBdr>
+        <w:spacing w:after="120" w:line="275" w:lineRule="auto"/>
+      </w:pPr>
+      <w:r>
+        <w:t xml:space="preserve">A </w:t>
+      </w:r>
+      <w:r>
+        <w:rPr>
+          <w:b/>
+          <w:bCs/>
+        </w:rPr>
+        <w:t>Book</w:t>
+      </w:r>
+      <w:r>
+        <w:t xml:space="preserve"> can have multiple </w:t>
+      </w:r>
+      <w:r>
+        <w:rPr>
+          <w:b/>
+          <w:bCs/>
+        </w:rPr>
+        <w:t>Review</w:t>
+      </w:r>
+      <w:r>
+        <w:t xml:space="preserve"> records.</w:t>
+      </w:r>
+    </w:p>
+    <w:p>
+      <w:pPr>
+        <w:numPr>
+          <w:ilvl w:val="0"/>
+          <w:numId w:val="25"/>
+        </w:numPr>
         <w:pBdr>
           <w:top w:val="nil"/>
           <w:left w:val="nil"/>
@@ -17052,21 +17236,83 @@
           <w:between w:val="nil"/>
         </w:pBdr>
         <w:spacing w:after="240" w:line="275" w:lineRule="auto"/>
-        <w:rPr>
-          <w:rFonts w:ascii="Google Sans Text" w:eastAsia="Google Sans Text" w:hAnsi="Google Sans Text" w:cs="Google Sans Text"/>
-          <w:color w:val="1B1C1D"/>
-          <w:sz w:val="24"/>
-          <w:szCs w:val="24"/>
-        </w:rPr>
-      </w:pPr>
-      <w:r>
-        <w:rPr>
-          <w:rFonts w:ascii="Google Sans Text" w:eastAsia="Google Sans Text" w:hAnsi="Google Sans Text" w:cs="Google Sans Text"/>
-          <w:color w:val="1B1C1D"/>
-          <w:sz w:val="24"/>
-          <w:szCs w:val="24"/>
-        </w:rPr>
-        <w:lastRenderedPageBreak/>
+      </w:pPr>
+      <w:r>
+        <w:t xml:space="preserve">A </w:t>
+      </w:r>
+      <w:r>
+        <w:rPr>
+          <w:b/>
+          <w:bCs/>
+        </w:rPr>
+        <w:t>User</w:t>
+      </w:r>
+      <w:r>
+        <w:t xml:space="preserve"> (Member) can write multiple </w:t>
+      </w:r>
+      <w:r>
+        <w:rPr>
+          <w:b/>
+          <w:bCs/>
+        </w:rPr>
+        <w:t>Review</w:t>
+      </w:r>
+      <w:r>
+        <w:t xml:space="preserve"> records. </w:t>
+      </w:r>
+      <w:r>
+        <w:rPr>
+          <w:b/>
+          <w:bCs/>
+        </w:rPr>
+        <w:t>(New Feature)</w:t>
+      </w:r>
+    </w:p>
+    <w:p>
+      <w:pPr>
+        <w:pStyle w:val="Heading2"/>
+        <w:spacing w:before="120" w:after="120" w:line="275" w:lineRule="auto"/>
+        <w:rPr>
+          <w:rFonts w:ascii="Google Sans" w:eastAsia="Google Sans" w:hAnsi="Google Sans" w:cs="Google Sans"/>
+          <w:color w:val="1B1C1D"/>
+          <w:sz w:val="30"/>
+          <w:szCs w:val="30"/>
+        </w:rPr>
+      </w:pPr>
+      <w:r>
+        <w:rPr>
+          <w:rFonts w:ascii="Google Sans" w:eastAsia="Google Sans" w:hAnsi="Google Sans" w:cs="Google Sans"/>
+          <w:color w:val="1B1C1D"/>
+          <w:sz w:val="30"/>
+          <w:szCs w:val="30"/>
+        </w:rPr>
+        <w:t>7. Key Use Cases</w:t>
+      </w:r>
+    </w:p>
+    <w:p>
+      <w:pPr>
+        <w:pBdr>
+          <w:top w:val="nil"/>
+          <w:left w:val="nil"/>
+          <w:bottom w:val="nil"/>
+          <w:right w:val="nil"/>
+          <w:between w:val="nil"/>
+        </w:pBdr>
+        <w:spacing w:after="240" w:line="275" w:lineRule="auto"/>
+        <w:rPr>
+          <w:rFonts w:ascii="Google Sans Text" w:eastAsia="Google Sans Text" w:hAnsi="Google Sans Text" w:cs="Google Sans Text"/>
+          <w:color w:val="1B1C1D"/>
+          <w:sz w:val="24"/>
+          <w:szCs w:val="24"/>
+        </w:rPr>
+      </w:pPr>
+      <w:r>
+        <w:rPr>
+          <w:rFonts w:ascii="Google Sans Text" w:eastAsia="Google Sans Text" w:hAnsi="Google Sans Text" w:cs="Google Sans Text"/>
+          <w:color w:val="1B1C1D"/>
+          <w:sz w:val="24"/>
+          <w:szCs w:val="24"/>
+        </w:rPr>
         <w:t>This section outlines some of the key use cases for the Library Management System.</w:t>
       </w:r>
     </w:p>
@@ -17404,25 +17650,14 @@
         </w:pBdr>
         <w:spacing w:line="275" w:lineRule="auto"/>
       </w:pPr>
-      <w:proofErr w:type="gramStart"/>
-      <w:r>
-        <w:rPr>
-          <w:rFonts w:ascii="Google Sans Text" w:eastAsia="Google Sans Text" w:hAnsi="Google Sans Text" w:cs="Google Sans Text"/>
-          <w:color w:val="1B1C1D"/>
-          <w:sz w:val="24"/>
-          <w:szCs w:val="24"/>
-        </w:rPr>
-        <w:t>User enters</w:t>
-      </w:r>
-      <w:proofErr w:type="gramEnd"/>
-      <w:r>
-        <w:rPr>
-          <w:rFonts w:ascii="Google Sans Text" w:eastAsia="Google Sans Text" w:hAnsi="Google Sans Text" w:cs="Google Sans Text"/>
-          <w:color w:val="1B1C1D"/>
-          <w:sz w:val="24"/>
-          <w:szCs w:val="24"/>
-        </w:rPr>
-        <w:t xml:space="preserve"> their email address.</w:t>
+      <w:r>
+        <w:rPr>
+          <w:rFonts w:ascii="Google Sans Text" w:eastAsia="Google Sans Text" w:hAnsi="Google Sans Text" w:cs="Google Sans Text"/>
+          <w:color w:val="1B1C1D"/>
+          <w:sz w:val="24"/>
+          <w:szCs w:val="24"/>
+        </w:rPr>
+        <w:t>User enters their email address.</w:t>
       </w:r>
     </w:p>
     <w:p>
@@ -17440,25 +17675,14 @@
         </w:pBdr>
         <w:spacing w:line="275" w:lineRule="auto"/>
       </w:pPr>
-      <w:proofErr w:type="gramStart"/>
-      <w:r>
-        <w:rPr>
-          <w:rFonts w:ascii="Google Sans Text" w:eastAsia="Google Sans Text" w:hAnsi="Google Sans Text" w:cs="Google Sans Text"/>
-          <w:color w:val="1B1C1D"/>
-          <w:sz w:val="24"/>
-          <w:szCs w:val="24"/>
-        </w:rPr>
-        <w:t>User enters</w:t>
-      </w:r>
-      <w:proofErr w:type="gramEnd"/>
-      <w:r>
-        <w:rPr>
-          <w:rFonts w:ascii="Google Sans Text" w:eastAsia="Google Sans Text" w:hAnsi="Google Sans Text" w:cs="Google Sans Text"/>
-          <w:color w:val="1B1C1D"/>
-          <w:sz w:val="24"/>
-          <w:szCs w:val="24"/>
-        </w:rPr>
-        <w:t xml:space="preserve"> their password.</w:t>
+      <w:r>
+        <w:rPr>
+          <w:rFonts w:ascii="Google Sans Text" w:eastAsia="Google Sans Text" w:hAnsi="Google Sans Text" w:cs="Google Sans Text"/>
+          <w:color w:val="1B1C1D"/>
+          <w:sz w:val="24"/>
+          <w:szCs w:val="24"/>
+        </w:rPr>
+        <w:t>User enters their password.</w:t>
       </w:r>
     </w:p>
     <w:p>
@@ -17501,25 +17725,14 @@
         </w:pBdr>
         <w:spacing w:line="275" w:lineRule="auto"/>
       </w:pPr>
-      <w:proofErr w:type="gramStart"/>
-      <w:r>
-        <w:rPr>
-          <w:rFonts w:ascii="Google Sans Text" w:eastAsia="Google Sans Text" w:hAnsi="Google Sans Text" w:cs="Google Sans Text"/>
-          <w:color w:val="1B1C1D"/>
-          <w:sz w:val="24"/>
-          <w:szCs w:val="24"/>
-        </w:rPr>
-        <w:t>System</w:t>
-      </w:r>
-      <w:proofErr w:type="gramEnd"/>
-      <w:r>
-        <w:rPr>
-          <w:rFonts w:ascii="Google Sans Text" w:eastAsia="Google Sans Text" w:hAnsi="Google Sans Text" w:cs="Google Sans Text"/>
-          <w:color w:val="1B1C1D"/>
-          <w:sz w:val="24"/>
-          <w:szCs w:val="24"/>
-        </w:rPr>
-        <w:t xml:space="preserve"> validates the input fields (e.g., not empty).</w:t>
+      <w:r>
+        <w:rPr>
+          <w:rFonts w:ascii="Google Sans Text" w:eastAsia="Google Sans Text" w:hAnsi="Google Sans Text" w:cs="Google Sans Text"/>
+          <w:color w:val="1B1C1D"/>
+          <w:sz w:val="24"/>
+          <w:szCs w:val="24"/>
+        </w:rPr>
+        <w:t>System validates the input fields (e.g., not empty).</w:t>
       </w:r>
     </w:p>
     <w:p>
@@ -17544,7 +17757,17 @@
           <w:sz w:val="24"/>
           <w:szCs w:val="24"/>
         </w:rPr>
-        <w:t>System authenticates the user's credentials against the User collection in the database (verifies email and password hash).</w:t>
+        <w:t xml:space="preserve">System authenticates the user's credentials against the User collection in the </w:t>
+      </w:r>
+      <w:r>
+        <w:rPr>
+          <w:rFonts w:ascii="Google Sans Text" w:eastAsia="Google Sans Text" w:hAnsi="Google Sans Text" w:cs="Google Sans Text"/>
+          <w:color w:val="1B1C1D"/>
+          <w:sz w:val="24"/>
+          <w:szCs w:val="24"/>
+        </w:rPr>
+        <w:lastRenderedPageBreak/>
+        <w:t>database (verifies email and password hash).</w:t>
       </w:r>
     </w:p>
     <w:p>
@@ -17798,7 +18021,6 @@
           <w:sz w:val="24"/>
           <w:szCs w:val="24"/>
         </w:rPr>
-        <w:lastRenderedPageBreak/>
         <w:t>7.2. UC-002: Add New Book (Librarian)</w:t>
       </w:r>
     </w:p>
@@ -17945,27 +18167,7 @@
           <w:sz w:val="24"/>
           <w:szCs w:val="24"/>
         </w:rPr>
-        <w:t xml:space="preserve">The Librarian has </w:t>
-      </w:r>
-      <w:proofErr w:type="gramStart"/>
-      <w:r>
-        <w:rPr>
-          <w:rFonts w:ascii="Google Sans Text" w:eastAsia="Google Sans Text" w:hAnsi="Google Sans Text" w:cs="Google Sans Text"/>
-          <w:color w:val="1B1C1D"/>
-          <w:sz w:val="24"/>
-          <w:szCs w:val="24"/>
-        </w:rPr>
-        <w:t>navigated to</w:t>
-      </w:r>
-      <w:proofErr w:type="gramEnd"/>
-      <w:r>
-        <w:rPr>
-          <w:rFonts w:ascii="Google Sans Text" w:eastAsia="Google Sans Text" w:hAnsi="Google Sans Text" w:cs="Google Sans Text"/>
-          <w:color w:val="1B1C1D"/>
-          <w:sz w:val="24"/>
-          <w:szCs w:val="24"/>
-        </w:rPr>
-        <w:t xml:space="preserve"> the Book Management page (/books).</w:t>
+        <w:t>The Librarian has navigated to the Book Management page (/books).</w:t>
       </w:r>
     </w:p>
     <w:p>
@@ -18160,25 +18362,14 @@
         </w:pBdr>
         <w:spacing w:line="275" w:lineRule="auto"/>
       </w:pPr>
-      <w:proofErr w:type="gramStart"/>
-      <w:r>
-        <w:rPr>
-          <w:rFonts w:ascii="Google Sans Text" w:eastAsia="Google Sans Text" w:hAnsi="Google Sans Text" w:cs="Google Sans Text"/>
-          <w:color w:val="1B1C1D"/>
-          <w:sz w:val="24"/>
-          <w:szCs w:val="24"/>
-        </w:rPr>
-        <w:t>System</w:t>
-      </w:r>
-      <w:proofErr w:type="gramEnd"/>
-      <w:r>
-        <w:rPr>
-          <w:rFonts w:ascii="Google Sans Text" w:eastAsia="Google Sans Text" w:hAnsi="Google Sans Text" w:cs="Google Sans Text"/>
-          <w:color w:val="1B1C1D"/>
-          <w:sz w:val="24"/>
-          <w:szCs w:val="24"/>
-        </w:rPr>
-        <w:t xml:space="preserve"> displays the "Add Book" form/modal.</w:t>
+      <w:r>
+        <w:rPr>
+          <w:rFonts w:ascii="Google Sans Text" w:eastAsia="Google Sans Text" w:hAnsi="Google Sans Text" w:cs="Google Sans Text"/>
+          <w:color w:val="1B1C1D"/>
+          <w:sz w:val="24"/>
+          <w:szCs w:val="24"/>
+        </w:rPr>
+        <w:t>System displays the "Add Book" form/modal.</w:t>
       </w:r>
     </w:p>
     <w:p>
@@ -18321,25 +18512,14 @@
         </w:pBdr>
         <w:spacing w:line="275" w:lineRule="auto"/>
       </w:pPr>
-      <w:proofErr w:type="gramStart"/>
-      <w:r>
-        <w:rPr>
-          <w:rFonts w:ascii="Google Sans Text" w:eastAsia="Google Sans Text" w:hAnsi="Google Sans Text" w:cs="Google Sans Text"/>
-          <w:color w:val="1B1C1D"/>
-          <w:sz w:val="24"/>
-          <w:szCs w:val="24"/>
-        </w:rPr>
-        <w:t>System</w:t>
-      </w:r>
-      <w:proofErr w:type="gramEnd"/>
-      <w:r>
-        <w:rPr>
-          <w:rFonts w:ascii="Google Sans Text" w:eastAsia="Google Sans Text" w:hAnsi="Google Sans Text" w:cs="Google Sans Text"/>
-          <w:color w:val="1B1C1D"/>
-          <w:sz w:val="24"/>
-          <w:szCs w:val="24"/>
-        </w:rPr>
-        <w:t xml:space="preserve"> validates the input data (e.g., required fields).</w:t>
+      <w:r>
+        <w:rPr>
+          <w:rFonts w:ascii="Google Sans Text" w:eastAsia="Google Sans Text" w:hAnsi="Google Sans Text" w:cs="Google Sans Text"/>
+          <w:color w:val="1B1C1D"/>
+          <w:sz w:val="24"/>
+          <w:szCs w:val="24"/>
+        </w:rPr>
+        <w:t>System validates the input data (e.g., required fields).</w:t>
       </w:r>
     </w:p>
     <w:p>
@@ -18384,7 +18564,17 @@
           <w:sz w:val="24"/>
           <w:szCs w:val="24"/>
         </w:rPr>
-        <w:t>/book/add) with the book data.</w:t>
+        <w:t xml:space="preserve">/book/add) with the </w:t>
+      </w:r>
+      <w:r>
+        <w:rPr>
+          <w:rFonts w:ascii="Google Sans Text" w:eastAsia="Google Sans Text" w:hAnsi="Google Sans Text" w:cs="Google Sans Text"/>
+          <w:color w:val="1B1C1D"/>
+          <w:sz w:val="24"/>
+          <w:szCs w:val="24"/>
+        </w:rPr>
+        <w:lastRenderedPageBreak/>
+        <w:t>book data.</w:t>
       </w:r>
     </w:p>
     <w:p>
@@ -18637,17 +18827,7 @@
           <w:sz w:val="24"/>
           <w:szCs w:val="24"/>
         </w:rPr>
-        <w:t xml:space="preserve">If the backend API returns an error (e.g., database error, unexpected issue), the system displays a generic error message (e.g., "Something </w:t>
-      </w:r>
-      <w:r>
-        <w:rPr>
-          <w:rFonts w:ascii="Google Sans Text" w:eastAsia="Google Sans Text" w:hAnsi="Google Sans Text" w:cs="Google Sans Text"/>
-          <w:color w:val="1B1C1D"/>
-          <w:sz w:val="24"/>
-          <w:szCs w:val="24"/>
-        </w:rPr>
-        <w:lastRenderedPageBreak/>
-        <w:t>went wrong, please try again").</w:t>
+        <w:t>If the backend API returns an error (e.g., database error, unexpected issue), the system displays a generic error message (e.g., "Something went wrong, please try again").</w:t>
       </w:r>
     </w:p>
     <w:p>
@@ -19003,7 +19183,6 @@
         <w:t xml:space="preserve">The availability status of the borrowed book might be updated (e.g., </w:t>
       </w:r>
       <w:proofErr w:type="spellStart"/>
-      <w:proofErr w:type="gramStart"/>
       <w:r>
         <w:rPr>
           <w:rFonts w:ascii="Google Sans Text" w:eastAsia="Google Sans Text" w:hAnsi="Google Sans Text" w:cs="Google Sans Text"/>
@@ -19014,7 +19193,6 @@
         <w:t>isAvailable</w:t>
       </w:r>
       <w:proofErr w:type="spellEnd"/>
-      <w:proofErr w:type="gramEnd"/>
       <w:r>
         <w:rPr>
           <w:rFonts w:ascii="Google Sans Text" w:eastAsia="Google Sans Text" w:hAnsi="Google Sans Text" w:cs="Google Sans Text"/>
@@ -19278,7 +19456,17 @@
           <w:sz w:val="24"/>
           <w:szCs w:val="24"/>
         </w:rPr>
-        <w:t xml:space="preserve"> or selected (if a librarian is doing it on behalf of a member, but the use case title implies member action). The client logic ensures </w:t>
+        <w:t xml:space="preserve"> or selected (if a librarian is doing it on behalf of a member, but the use case title implies member action). The client </w:t>
+      </w:r>
+      <w:r>
+        <w:rPr>
+          <w:rFonts w:ascii="Google Sans Text" w:eastAsia="Google Sans Text" w:hAnsi="Google Sans Text" w:cs="Google Sans Text"/>
+          <w:color w:val="1B1C1D"/>
+          <w:sz w:val="24"/>
+          <w:szCs w:val="24"/>
+        </w:rPr>
+        <w:lastRenderedPageBreak/>
+        <w:t xml:space="preserve">logic ensures </w:t>
       </w:r>
       <w:proofErr w:type="spellStart"/>
       <w:r>
@@ -19366,25 +19554,14 @@
         </w:pBdr>
         <w:spacing w:line="275" w:lineRule="auto"/>
       </w:pPr>
-      <w:proofErr w:type="gramStart"/>
-      <w:r>
-        <w:rPr>
-          <w:rFonts w:ascii="Google Sans Text" w:eastAsia="Google Sans Text" w:hAnsi="Google Sans Text" w:cs="Google Sans Text"/>
-          <w:color w:val="1B1C1D"/>
-          <w:sz w:val="24"/>
-          <w:szCs w:val="24"/>
-        </w:rPr>
-        <w:t>System</w:t>
-      </w:r>
-      <w:proofErr w:type="gramEnd"/>
-      <w:r>
-        <w:rPr>
-          <w:rFonts w:ascii="Google Sans Text" w:eastAsia="Google Sans Text" w:hAnsi="Google Sans Text" w:cs="Google Sans Text"/>
-          <w:color w:val="1B1C1D"/>
-          <w:sz w:val="24"/>
-          <w:szCs w:val="24"/>
-        </w:rPr>
-        <w:t xml:space="preserve"> validates the input.</w:t>
+      <w:r>
+        <w:rPr>
+          <w:rFonts w:ascii="Google Sans Text" w:eastAsia="Google Sans Text" w:hAnsi="Google Sans Text" w:cs="Google Sans Text"/>
+          <w:color w:val="1B1C1D"/>
+          <w:sz w:val="24"/>
+          <w:szCs w:val="24"/>
+        </w:rPr>
+        <w:t>System validates the input.</w:t>
       </w:r>
     </w:p>
     <w:p>
@@ -19577,25 +19754,14 @@
         </w:pBdr>
         <w:spacing w:line="275" w:lineRule="auto"/>
       </w:pPr>
-      <w:proofErr w:type="gramStart"/>
-      <w:r>
-        <w:rPr>
-          <w:rFonts w:ascii="Google Sans Text" w:eastAsia="Google Sans Text" w:hAnsi="Google Sans Text" w:cs="Google Sans Text"/>
-          <w:color w:val="1B1C1D"/>
-          <w:sz w:val="24"/>
-          <w:szCs w:val="24"/>
-        </w:rPr>
-        <w:t>System</w:t>
-      </w:r>
-      <w:proofErr w:type="gramEnd"/>
-      <w:r>
-        <w:rPr>
-          <w:rFonts w:ascii="Google Sans Text" w:eastAsia="Google Sans Text" w:hAnsi="Google Sans Text" w:cs="Google Sans Text"/>
-          <w:color w:val="1B1C1D"/>
-          <w:sz w:val="24"/>
-          <w:szCs w:val="24"/>
-        </w:rPr>
-        <w:t xml:space="preserve"> displays a success message (e.g., "</w:t>
+      <w:r>
+        <w:rPr>
+          <w:rFonts w:ascii="Google Sans Text" w:eastAsia="Google Sans Text" w:hAnsi="Google Sans Text" w:cs="Google Sans Text"/>
+          <w:color w:val="1B1C1D"/>
+          <w:sz w:val="24"/>
+          <w:szCs w:val="24"/>
+        </w:rPr>
+        <w:t>System displays a success message (e.g., "</w:t>
       </w:r>
       <w:proofErr w:type="spellStart"/>
       <w:r>
@@ -19782,7 +19948,6 @@
           <w:sz w:val="24"/>
           <w:szCs w:val="24"/>
         </w:rPr>
-        <w:lastRenderedPageBreak/>
         <w:t>If the selected book is not available, the system prevents submission or displays an error.</w:t>
       </w:r>
     </w:p>
@@ -20171,25 +20336,14 @@
         </w:pBdr>
         <w:spacing w:line="275" w:lineRule="auto"/>
       </w:pPr>
-      <w:proofErr w:type="gramStart"/>
-      <w:r>
-        <w:rPr>
-          <w:rFonts w:ascii="Google Sans Text" w:eastAsia="Google Sans Text" w:hAnsi="Google Sans Text" w:cs="Google Sans Text"/>
-          <w:color w:val="1B1C1D"/>
-          <w:sz w:val="24"/>
-          <w:szCs w:val="24"/>
-        </w:rPr>
-        <w:t>System</w:t>
-      </w:r>
-      <w:proofErr w:type="gramEnd"/>
-      <w:r>
-        <w:rPr>
-          <w:rFonts w:ascii="Google Sans Text" w:eastAsia="Google Sans Text" w:hAnsi="Google Sans Text" w:cs="Google Sans Text"/>
-          <w:color w:val="1B1C1D"/>
-          <w:sz w:val="24"/>
-          <w:szCs w:val="24"/>
-        </w:rPr>
-        <w:t xml:space="preserve"> displays the "Add User" form/modal.</w:t>
+      <w:r>
+        <w:rPr>
+          <w:rFonts w:ascii="Google Sans Text" w:eastAsia="Google Sans Text" w:hAnsi="Google Sans Text" w:cs="Google Sans Text"/>
+          <w:color w:val="1B1C1D"/>
+          <w:sz w:val="24"/>
+          <w:szCs w:val="24"/>
+        </w:rPr>
+        <w:t>System displays the "Add User" form/modal.</w:t>
       </w:r>
     </w:p>
     <w:p>
@@ -20314,6 +20468,7 @@
           <w:sz w:val="24"/>
           <w:szCs w:val="24"/>
         </w:rPr>
+        <w:lastRenderedPageBreak/>
         <w:t>System sends a request to the backend API (POST /</w:t>
       </w:r>
       <w:proofErr w:type="spellStart"/>
@@ -20397,25 +20552,14 @@
         </w:pBdr>
         <w:spacing w:line="275" w:lineRule="auto"/>
       </w:pPr>
-      <w:proofErr w:type="gramStart"/>
-      <w:r>
-        <w:rPr>
-          <w:rFonts w:ascii="Google Sans Text" w:eastAsia="Google Sans Text" w:hAnsi="Google Sans Text" w:cs="Google Sans Text"/>
-          <w:color w:val="1B1C1D"/>
-          <w:sz w:val="24"/>
-          <w:szCs w:val="24"/>
-        </w:rPr>
-        <w:t>System</w:t>
-      </w:r>
-      <w:proofErr w:type="gramEnd"/>
-      <w:r>
-        <w:rPr>
-          <w:rFonts w:ascii="Google Sans Text" w:eastAsia="Google Sans Text" w:hAnsi="Google Sans Text" w:cs="Google Sans Text"/>
-          <w:color w:val="1B1C1D"/>
-          <w:sz w:val="24"/>
-          <w:szCs w:val="24"/>
-        </w:rPr>
-        <w:t xml:space="preserve"> displays a success message (e.g., "User added" or "User registered").</w:t>
+      <w:r>
+        <w:rPr>
+          <w:rFonts w:ascii="Google Sans Text" w:eastAsia="Google Sans Text" w:hAnsi="Google Sans Text" w:cs="Google Sans Text"/>
+          <w:color w:val="1B1C1D"/>
+          <w:sz w:val="24"/>
+          <w:szCs w:val="24"/>
+        </w:rPr>
+        <w:t>System displays a success message (e.g., "User added" or "User registered").</w:t>
       </w:r>
     </w:p>
     <w:p>
@@ -20618,17 +20762,7 @@
           <w:sz w:val="24"/>
           <w:szCs w:val="24"/>
         </w:rPr>
-        <w:t xml:space="preserve">If any required fields are missing or data is invalid, the system displays an </w:t>
-      </w:r>
-      <w:r>
-        <w:rPr>
-          <w:rFonts w:ascii="Google Sans Text" w:eastAsia="Google Sans Text" w:hAnsi="Google Sans Text" w:cs="Google Sans Text"/>
-          <w:color w:val="1B1C1D"/>
-          <w:sz w:val="24"/>
-          <w:szCs w:val="24"/>
-        </w:rPr>
-        <w:lastRenderedPageBreak/>
-        <w:t>error message.</w:t>
+        <w:t>If any required fields are missing or data is invalid, the system displays an error message.</w:t>
       </w:r>
     </w:p>
     <w:p>
@@ -21342,6 +21476,7 @@
           <w:sz w:val="24"/>
           <w:szCs w:val="24"/>
         </w:rPr>
+        <w:lastRenderedPageBreak/>
         <w:t xml:space="preserve">If the Member has no </w:t>
       </w:r>
       <w:proofErr w:type="spellStart"/>
@@ -37261,7 +37396,6 @@
   <w:style w:type="character" w:default="1" w:styleId="DefaultParagraphFont">
     <w:name w:val="Default Paragraph Font"/>
     <w:uiPriority w:val="1"/>
-    <w:semiHidden/>
     <w:unhideWhenUsed/>
   </w:style>
   <w:style w:type="table" w:default="1" w:styleId="TableNormal">
@@ -37411,6 +37545,19 @@
         <w:right w:w="100" w:type="dxa"/>
       </w:tblCellMar>
     </w:tblPr>
+  </w:style>
+  <w:style w:type="character" w:styleId="HTMLCode">
+    <w:name w:val="HTML Code"/>
+    <w:basedOn w:val="DefaultParagraphFont"/>
+    <w:uiPriority w:val="99"/>
+    <w:semiHidden/>
+    <w:unhideWhenUsed/>
+    <w:rsid w:val="00A77854"/>
+    <w:rPr>
+      <w:rFonts w:ascii="Courier New" w:eastAsia="Times New Roman" w:hAnsi="Courier New" w:cs="Courier New"/>
+      <w:sz w:val="20"/>
+      <w:szCs w:val="20"/>
+    </w:rPr>
   </w:style>
 </w:styles>
 </file>

</xml_diff>